<commit_message>
Falta el ejemplo de ejecucion y la bibliografia
</commit_message>
<xml_diff>
--- a/documento.docx
+++ b/documento.docx
@@ -31,7 +31,7 @@
                     </pic:cNvPicPr>
                   </pic:nvPicPr>
                   <pic:blipFill>
-                    <a:blip r:embed="rId5"/>
+                    <a:blip r:embed="rId6"/>
                     <a:stretch>
                       <a:fillRect/>
                     </a:stretch>
@@ -81,7 +81,7 @@
                     </pic:cNvPicPr>
                   </pic:nvPicPr>
                   <pic:blipFill>
-                    <a:blip r:embed="rId6"/>
+                    <a:blip r:embed="rId7"/>
                     <a:stretch>
                       <a:fillRect/>
                     </a:stretch>
@@ -304,9 +304,12 @@
           <w:szCs w:val="28"/>
           <w:lang w:val="es-MX"/>
         </w:rPr>
-        <w:t>Sebastián</w:t>
-      </w:r>
-      <w:r>
+        <w:t>Sebastián Calderón Carrillo 2087472</w:t>
+      </w:r>
+    </w:p>
+    <w:p>
+      <w:pPr>
+        <w:jc w:val="center"/>
         <w:rPr>
           <w:b/>
           <w:bCs/>
@@ -314,35 +317,31 @@
           <w:szCs w:val="28"/>
           <w:lang w:val="es-MX"/>
         </w:rPr>
-        <w:t xml:space="preserve"> Calderón Carrillo 2087472</w:t>
-      </w:r>
-    </w:p>
-    <w:p>
-      <w:pPr>
-        <w:jc w:val="center"/>
-        <w:rPr>
-          <w:rFonts w:ascii="Calibri" w:hAnsi="Calibri"/>
+      </w:pPr>
+      <w:r>
+        <w:rPr>
           <w:b/>
           <w:bCs/>
           <w:sz w:val="28"/>
           <w:szCs w:val="28"/>
           <w:lang w:val="es-MX"/>
         </w:rPr>
-      </w:pPr>
-      <w:r>
-        <w:rPr>
+        <w:t>Edson Armando Amaya Macias 2151976</w:t>
+      </w:r>
+    </w:p>
+    <w:p>
+      <w:pPr>
+        <w:jc w:val="center"/>
+        <w:rPr>
+          <w:rFonts w:ascii="Calibri" w:hAnsi="Calibri"/>
           <w:b/>
           <w:bCs/>
           <w:sz w:val="28"/>
           <w:szCs w:val="28"/>
           <w:lang w:val="es-MX"/>
         </w:rPr>
-        <w:t>Edson Armando Amaya Macias 2151976</w:t>
-      </w:r>
-    </w:p>
-    <w:p>
-      <w:pPr>
-        <w:jc w:val="center"/>
+      </w:pPr>
+      <w:r>
         <w:rPr>
           <w:rFonts w:ascii="Calibri" w:hAnsi="Calibri"/>
           <w:b/>
@@ -351,23 +350,37 @@
           <w:szCs w:val="28"/>
           <w:lang w:val="es-MX"/>
         </w:rPr>
-      </w:pPr>
+        <w:t>Juan José Trujillo Garza 1972407</w:t>
+      </w:r>
     </w:p>
     <w:p>
       <w:pPr>
         <w:jc w:val="center"/>
         <w:rPr>
-          <w:lang w:val="es-MX"/>
-        </w:rPr>
-      </w:pPr>
-      <w:r>
-        <w:rPr>
+          <w:rFonts w:ascii="Calibri" w:hAnsi="Calibri"/>
           <w:b/>
           <w:bCs/>
           <w:sz w:val="28"/>
           <w:szCs w:val="28"/>
           <w:lang w:val="es-MX"/>
         </w:rPr>
+      </w:pPr>
+    </w:p>
+    <w:p>
+      <w:pPr>
+        <w:jc w:val="center"/>
+        <w:rPr>
+          <w:lang w:val="es-MX"/>
+        </w:rPr>
+      </w:pPr>
+      <w:r>
+        <w:rPr>
+          <w:b/>
+          <w:bCs/>
+          <w:sz w:val="28"/>
+          <w:szCs w:val="28"/>
+          <w:lang w:val="es-MX"/>
+        </w:rPr>
         <w:t>Grupo 031</w:t>
       </w:r>
     </w:p>
@@ -418,10 +431,7 @@
           <w:lang w:val="es-MX"/>
         </w:rPr>
       </w:pPr>
-    </w:p>
-    <w:p>
-      <w:pPr>
-        <w:spacing w:after="120"/>
+      <w:r>
         <w:rPr>
           <w:b/>
           <w:bCs/>
@@ -429,366 +439,367 @@
           <w:szCs w:val="32"/>
           <w:lang w:val="es-MX"/>
         </w:rPr>
-      </w:pPr>
-      <w:r>
-        <w:rPr>
+        <w:lastRenderedPageBreak/>
+        <w:t>Introducción</w:t>
+      </w:r>
+    </w:p>
+    <w:p>
+      <w:pPr>
+        <w:spacing w:after="120"/>
+        <w:rPr>
+          <w:rFonts w:cstheme="minorHAnsi"/>
+          <w:sz w:val="24"/>
+          <w:szCs w:val="24"/>
+          <w:lang w:val="es-MX"/>
+        </w:rPr>
+      </w:pPr>
+      <w:r>
+        <w:rPr>
+          <w:rFonts w:cstheme="minorHAnsi"/>
+          <w:sz w:val="24"/>
+          <w:szCs w:val="24"/>
+          <w:lang w:val="es-MX"/>
+        </w:rPr>
+        <w:t>El método de bisección, también conocido como método de búsqueda binaria o de Bolzano, es un algoritmo numérico para encontrar raíces de funciones continuas. Se basa en el teorema del valor intermedio: si una función continua cambia de signo en los extremos de un intervalo [a, b], entonces existe al menos una raíz en dicho intervalo. El método divide repetidamente el intervalo a la mitad y selecciona el subintervalo donde ocurre el cambio de signo, garantizando convergencia hacia una raíz con una precisión controlada por una tolerancia dada.</w:t>
+      </w:r>
+    </w:p>
+    <w:p>
+      <w:pPr>
+        <w:spacing w:after="120"/>
+        <w:rPr>
+          <w:rFonts w:cstheme="minorHAnsi"/>
+          <w:sz w:val="24"/>
+          <w:szCs w:val="24"/>
+          <w:lang w:val="es-MX"/>
+        </w:rPr>
+      </w:pPr>
+      <w:r>
+        <w:rPr>
+          <w:rFonts w:cstheme="minorHAnsi"/>
+          <w:sz w:val="24"/>
+          <w:szCs w:val="24"/>
+          <w:lang w:val="es-MX"/>
+        </w:rPr>
+        <w:t>A diferencia de otros métodos como Newton-Raphson, la bisección no requiere derivadas y siempre converge para funciones continuas con cambio de signo, aunque su convergencia es más lenta (lineal). Es un método robusto y fácil de implementar, ideal para obtener una primera aproximación de la raíz.</w:t>
+      </w:r>
+    </w:p>
+    <w:p>
+      <w:pPr>
+        <w:spacing w:after="120"/>
+        <w:rPr>
+          <w:rFonts w:cstheme="minorHAnsi"/>
+          <w:sz w:val="24"/>
+          <w:szCs w:val="24"/>
+          <w:lang w:val="es-MX"/>
+        </w:rPr>
+      </w:pPr>
+      <w:r>
+        <w:rPr>
+          <w:rFonts w:cstheme="minorHAnsi"/>
+          <w:sz w:val="24"/>
+          <w:szCs w:val="24"/>
+          <w:lang w:val="es-MX"/>
+        </w:rPr>
+        <w:t>Para la implementación en Python se dividió el proyecto en módulos con responsabilidades separadas</w:t>
+      </w:r>
+      <w:r>
+        <w:rPr>
+          <w:rFonts w:cstheme="minorHAnsi"/>
+          <w:i/>
+          <w:iCs/>
+          <w:sz w:val="24"/>
+          <w:szCs w:val="24"/>
+          <w:lang w:val="es-MX"/>
+        </w:rPr>
+        <w:t xml:space="preserve">: </w:t>
+      </w:r>
+      <w:r>
+        <w:rPr>
+          <w:rFonts w:cstheme="minorHAnsi"/>
+          <w:b/>
+          <w:bCs/>
+          <w:i/>
+          <w:iCs/>
+          <w:sz w:val="24"/>
+          <w:szCs w:val="24"/>
+          <w:lang w:val="es-MX"/>
+        </w:rPr>
+        <w:t>modules/biseccion.py</w:t>
+      </w:r>
+      <w:r>
+        <w:rPr>
+          <w:rFonts w:cstheme="minorHAnsi"/>
+          <w:sz w:val="24"/>
+          <w:szCs w:val="24"/>
+          <w:lang w:val="es-MX"/>
+        </w:rPr>
+        <w:t xml:space="preserve"> concentra la lógica matemática (evaluación de polinomios, algoritmo de bisección y generación del historial de iteraciones), </w:t>
+      </w:r>
+      <w:r>
+        <w:rPr>
+          <w:rFonts w:cstheme="minorHAnsi"/>
+          <w:b/>
+          <w:bCs/>
+          <w:i/>
+          <w:iCs/>
+          <w:sz w:val="24"/>
+          <w:szCs w:val="24"/>
+          <w:lang w:val="es-MX"/>
+        </w:rPr>
+        <w:t>modules/utils.py</w:t>
+      </w:r>
+      <w:r>
+        <w:rPr>
+          <w:rFonts w:cstheme="minorHAnsi"/>
+          <w:sz w:val="24"/>
+          <w:szCs w:val="24"/>
+          <w:lang w:val="es-MX"/>
+        </w:rPr>
+        <w:t xml:space="preserve"> se encarga de la validación y lectura de datos por consola, y </w:t>
+      </w:r>
+      <w:r>
+        <w:rPr>
+          <w:rFonts w:cstheme="minorHAnsi"/>
+          <w:b/>
+          <w:bCs/>
+          <w:i/>
+          <w:iCs/>
+          <w:sz w:val="24"/>
+          <w:szCs w:val="24"/>
+          <w:lang w:val="es-MX"/>
+        </w:rPr>
+        <w:t>modules/menu.py</w:t>
+      </w:r>
+      <w:r>
+        <w:rPr>
+          <w:rFonts w:cstheme="minorHAnsi"/>
+          <w:sz w:val="24"/>
+          <w:szCs w:val="24"/>
+          <w:lang w:val="es-MX"/>
+        </w:rPr>
+        <w:t xml:space="preserve"> implementa el menú interactivo que conecta ambos módulos. </w:t>
+      </w:r>
+    </w:p>
+    <w:p>
+      <w:pPr>
+        <w:spacing w:after="120"/>
+        <w:rPr>
+          <w:rFonts w:cstheme="minorHAnsi"/>
+          <w:sz w:val="24"/>
+          <w:szCs w:val="24"/>
+          <w:lang w:val="es-MX"/>
+        </w:rPr>
+      </w:pPr>
+      <w:r>
+        <w:rPr>
+          <w:rFonts w:cstheme="minorHAnsi"/>
+          <w:sz w:val="24"/>
+          <w:szCs w:val="24"/>
+          <w:lang w:val="es-MX"/>
+        </w:rPr>
+        <w:t xml:space="preserve">Como decisión de diseño clave, se utiliza una lista de coeficientes ordenados de mayor a menor grado para representar el polinomio, y se evalúa mediante la función </w:t>
+      </w:r>
+      <w:proofErr w:type="spellStart"/>
+      <w:r>
+        <w:rPr>
+          <w:rFonts w:cstheme="minorHAnsi"/>
+          <w:i/>
+          <w:iCs/>
+          <w:sz w:val="24"/>
+          <w:szCs w:val="24"/>
+          <w:lang w:val="es-MX"/>
+        </w:rPr>
+        <w:t>evaluar_polimonio</w:t>
+      </w:r>
+      <w:proofErr w:type="spellEnd"/>
+      <w:r>
+        <w:rPr>
+          <w:rFonts w:cstheme="minorHAnsi"/>
+          <w:sz w:val="24"/>
+          <w:szCs w:val="24"/>
+          <w:lang w:val="es-MX"/>
+        </w:rPr>
+        <w:t xml:space="preserve">, que aplica la suma de términos </w:t>
+      </w:r>
+      <w:r>
+        <w:rPr>
+          <w:rFonts w:cstheme="minorHAnsi"/>
+          <w:i/>
+          <w:iCs/>
+          <w:sz w:val="24"/>
+          <w:szCs w:val="24"/>
+          <w:lang w:val="es-MX"/>
+        </w:rPr>
+        <w:t xml:space="preserve">c * </w:t>
+      </w:r>
+      <w:proofErr w:type="spellStart"/>
+      <w:r>
+        <w:rPr>
+          <w:rFonts w:cstheme="minorHAnsi"/>
+          <w:i/>
+          <w:iCs/>
+          <w:sz w:val="24"/>
+          <w:szCs w:val="24"/>
+          <w:lang w:val="es-MX"/>
+        </w:rPr>
+        <w:t>x^grado</w:t>
+      </w:r>
+      <w:proofErr w:type="spellEnd"/>
+      <w:r>
+        <w:rPr>
+          <w:rFonts w:cstheme="minorHAnsi"/>
+          <w:sz w:val="24"/>
+          <w:szCs w:val="24"/>
+          <w:lang w:val="es-MX"/>
+        </w:rPr>
+        <w:t xml:space="preserve">. El núcleo del programa es la función </w:t>
+      </w:r>
+      <w:proofErr w:type="spellStart"/>
+      <w:r>
+        <w:rPr>
+          <w:rFonts w:cstheme="minorHAnsi"/>
+          <w:i/>
+          <w:iCs/>
+          <w:sz w:val="24"/>
+          <w:szCs w:val="24"/>
+          <w:lang w:val="es-MX"/>
+        </w:rPr>
+        <w:t>biseccion</w:t>
+      </w:r>
+      <w:proofErr w:type="spellEnd"/>
+      <w:r>
+        <w:rPr>
+          <w:rFonts w:cstheme="minorHAnsi"/>
+          <w:sz w:val="24"/>
+          <w:szCs w:val="24"/>
+          <w:lang w:val="es-MX"/>
+        </w:rPr>
+        <w:t>, que recibe los coeficientes, los límites del intervalo, la tolerancia y el número máximo de iteraciones, y devuelve la raíz aproximada, el número de iteraciones realizadas y una lista con el historial completo de cada iteración. Antes de aplicar el método, se verifica que exista un cambio de signo en el intervalo; si no lo hay, se lanza una excepción con un mensaje claro. Toda la entrada del usuario se valida con manejo de excepciones en utils.py, pidiendo nuevamente el dato en caso de error.</w:t>
+      </w:r>
+    </w:p>
+    <w:p>
+      <w:pPr>
+        <w:spacing w:after="120"/>
+        <w:rPr>
+          <w:rFonts w:cstheme="minorHAnsi"/>
+          <w:sz w:val="24"/>
+          <w:szCs w:val="24"/>
+          <w:lang w:val="es-MX"/>
+        </w:rPr>
+      </w:pPr>
+    </w:p>
+    <w:p>
+      <w:pPr>
+        <w:spacing w:after="120"/>
+        <w:rPr>
+          <w:rFonts w:cstheme="minorHAnsi"/>
+          <w:sz w:val="24"/>
+          <w:szCs w:val="24"/>
+          <w:lang w:val="es-MX"/>
+        </w:rPr>
+      </w:pPr>
+    </w:p>
+    <w:p>
+      <w:pPr>
+        <w:spacing w:after="120"/>
+        <w:rPr>
+          <w:rFonts w:cstheme="minorHAnsi"/>
+          <w:sz w:val="24"/>
+          <w:szCs w:val="24"/>
+          <w:lang w:val="es-MX"/>
+        </w:rPr>
+      </w:pPr>
+    </w:p>
+    <w:p>
+      <w:pPr>
+        <w:spacing w:after="120"/>
+        <w:rPr>
+          <w:rFonts w:cstheme="minorHAnsi"/>
+          <w:sz w:val="24"/>
+          <w:szCs w:val="24"/>
+          <w:lang w:val="es-MX"/>
+        </w:rPr>
+      </w:pPr>
+    </w:p>
+    <w:p>
+      <w:pPr>
+        <w:spacing w:after="120"/>
+        <w:rPr>
+          <w:rFonts w:cstheme="minorHAnsi"/>
+          <w:sz w:val="24"/>
+          <w:szCs w:val="24"/>
+          <w:lang w:val="es-MX"/>
+        </w:rPr>
+      </w:pPr>
+    </w:p>
+    <w:p>
+      <w:pPr>
+        <w:spacing w:after="120"/>
+        <w:rPr>
+          <w:rFonts w:cstheme="minorHAnsi"/>
+          <w:sz w:val="24"/>
+          <w:szCs w:val="24"/>
+          <w:lang w:val="es-MX"/>
+        </w:rPr>
+      </w:pPr>
+    </w:p>
+    <w:p>
+      <w:pPr>
+        <w:spacing w:after="120"/>
+        <w:rPr>
+          <w:rFonts w:cstheme="minorHAnsi"/>
+          <w:sz w:val="24"/>
+          <w:szCs w:val="24"/>
+          <w:lang w:val="es-MX"/>
+        </w:rPr>
+      </w:pPr>
+    </w:p>
+    <w:p>
+      <w:pPr>
+        <w:spacing w:after="120"/>
+        <w:rPr>
+          <w:rFonts w:cstheme="minorHAnsi"/>
+          <w:sz w:val="24"/>
+          <w:szCs w:val="24"/>
+          <w:lang w:val="es-MX"/>
+        </w:rPr>
+      </w:pPr>
+    </w:p>
+    <w:p>
+      <w:pPr>
+        <w:spacing w:after="120"/>
+        <w:rPr>
+          <w:rFonts w:cstheme="minorHAnsi"/>
+          <w:sz w:val="24"/>
+          <w:szCs w:val="24"/>
+          <w:lang w:val="es-MX"/>
+        </w:rPr>
+      </w:pPr>
+    </w:p>
+    <w:p>
+      <w:pPr>
+        <w:spacing w:after="120"/>
+        <w:rPr>
+          <w:rFonts w:cstheme="minorHAnsi"/>
+          <w:sz w:val="24"/>
+          <w:szCs w:val="24"/>
+          <w:lang w:val="es-MX"/>
+        </w:rPr>
+      </w:pPr>
+    </w:p>
+    <w:p>
+      <w:pPr>
+        <w:spacing w:after="120"/>
+        <w:rPr>
+          <w:rFonts w:cstheme="minorHAnsi"/>
           <w:b/>
           <w:bCs/>
           <w:sz w:val="32"/>
           <w:szCs w:val="32"/>
           <w:lang w:val="es-MX"/>
         </w:rPr>
-        <w:lastRenderedPageBreak/>
-        <w:t>Introducción</w:t>
-      </w:r>
-    </w:p>
-    <w:p>
-      <w:pPr>
-        <w:spacing w:after="120"/>
-        <w:rPr>
-          <w:rFonts w:cstheme="minorHAnsi"/>
-          <w:sz w:val="24"/>
-          <w:szCs w:val="24"/>
-          <w:lang w:val="es-MX"/>
-        </w:rPr>
-      </w:pPr>
-      <w:r>
-        <w:rPr>
-          <w:rFonts w:cstheme="minorHAnsi"/>
-          <w:sz w:val="24"/>
-          <w:szCs w:val="24"/>
-          <w:lang w:val="es-MX"/>
-        </w:rPr>
-        <w:t>El método de bisección, también conocido como método de búsqueda binaria o de Bolzano, es un algoritmo numérico para encontrar raíces de funciones continuas. Se basa en el teorema del valor intermedio: si una función continua cambia de signo en los extremos de un intervalo [a, b], entonces existe al menos una raíz en dicho intervalo. El método divide repetidamente el intervalo a la mitad y selecciona el subintervalo donde ocurre el cambio de signo, garantizando convergencia hacia una raíz con una precisión controlada por una tolerancia dada.</w:t>
-      </w:r>
-    </w:p>
-    <w:p>
-      <w:pPr>
-        <w:spacing w:after="120"/>
-        <w:rPr>
-          <w:rFonts w:cstheme="minorHAnsi"/>
-          <w:sz w:val="24"/>
-          <w:szCs w:val="24"/>
-          <w:lang w:val="es-MX"/>
-        </w:rPr>
-      </w:pPr>
-      <w:r>
-        <w:rPr>
-          <w:rFonts w:cstheme="minorHAnsi"/>
-          <w:sz w:val="24"/>
-          <w:szCs w:val="24"/>
-          <w:lang w:val="es-MX"/>
-        </w:rPr>
-        <w:t>A diferencia de otros métodos como Newton-Raphson, la bisección no requiere derivadas y siempre converge para funciones continuas con cambio de signo, aunque su convergencia es más lenta (lineal). Es un método robusto y fácil de implementar, ideal para obtener una primera aproximación de la raíz.</w:t>
-      </w:r>
-    </w:p>
-    <w:p>
-      <w:pPr>
-        <w:spacing w:after="120"/>
-        <w:rPr>
-          <w:rFonts w:cstheme="minorHAnsi"/>
-          <w:sz w:val="24"/>
-          <w:szCs w:val="24"/>
-          <w:lang w:val="es-MX"/>
-        </w:rPr>
-      </w:pPr>
-      <w:r>
-        <w:rPr>
-          <w:rFonts w:cstheme="minorHAnsi"/>
-          <w:sz w:val="24"/>
-          <w:szCs w:val="24"/>
-          <w:lang w:val="es-MX"/>
-        </w:rPr>
-        <w:t>Para la implementación en Python se dividió el proyecto en módulos con responsabilidades separadas</w:t>
-      </w:r>
-      <w:r>
-        <w:rPr>
-          <w:rFonts w:cstheme="minorHAnsi"/>
-          <w:i/>
-          <w:iCs/>
-          <w:sz w:val="24"/>
-          <w:szCs w:val="24"/>
-          <w:lang w:val="es-MX"/>
-        </w:rPr>
-        <w:t xml:space="preserve">: </w:t>
-      </w:r>
-      <w:r>
-        <w:rPr>
-          <w:rFonts w:cstheme="minorHAnsi"/>
-          <w:b/>
-          <w:bCs/>
-          <w:i/>
-          <w:iCs/>
-          <w:sz w:val="24"/>
-          <w:szCs w:val="24"/>
-          <w:lang w:val="es-MX"/>
-        </w:rPr>
-        <w:t>modules/biseccion.py</w:t>
-      </w:r>
-      <w:r>
-        <w:rPr>
-          <w:rFonts w:cstheme="minorHAnsi"/>
-          <w:sz w:val="24"/>
-          <w:szCs w:val="24"/>
-          <w:lang w:val="es-MX"/>
-        </w:rPr>
-        <w:t xml:space="preserve"> concentra la lógica matemática (evaluación de polinomios, algoritmo de bisección y generación del historial de iteraciones), </w:t>
-      </w:r>
-      <w:r>
-        <w:rPr>
-          <w:rFonts w:cstheme="minorHAnsi"/>
-          <w:b/>
-          <w:bCs/>
-          <w:i/>
-          <w:iCs/>
-          <w:sz w:val="24"/>
-          <w:szCs w:val="24"/>
-          <w:lang w:val="es-MX"/>
-        </w:rPr>
-        <w:t>modules/utils.py</w:t>
-      </w:r>
-      <w:r>
-        <w:rPr>
-          <w:rFonts w:cstheme="minorHAnsi"/>
-          <w:sz w:val="24"/>
-          <w:szCs w:val="24"/>
-          <w:lang w:val="es-MX"/>
-        </w:rPr>
-        <w:t xml:space="preserve"> se encarga de la validación y lectura de datos por consola, y </w:t>
-      </w:r>
-      <w:r>
-        <w:rPr>
-          <w:rFonts w:cstheme="minorHAnsi"/>
-          <w:b/>
-          <w:bCs/>
-          <w:i/>
-          <w:iCs/>
-          <w:sz w:val="24"/>
-          <w:szCs w:val="24"/>
-          <w:lang w:val="es-MX"/>
-        </w:rPr>
-        <w:t>modules/menu.py</w:t>
-      </w:r>
-      <w:r>
-        <w:rPr>
-          <w:rFonts w:cstheme="minorHAnsi"/>
-          <w:sz w:val="24"/>
-          <w:szCs w:val="24"/>
-          <w:lang w:val="es-MX"/>
-        </w:rPr>
-        <w:t xml:space="preserve"> implementa el menú interactivo que conecta ambos módulos. </w:t>
-      </w:r>
-    </w:p>
-    <w:p>
-      <w:pPr>
-        <w:spacing w:after="120"/>
-        <w:rPr>
-          <w:rFonts w:cstheme="minorHAnsi"/>
-          <w:sz w:val="24"/>
-          <w:szCs w:val="24"/>
-          <w:lang w:val="es-MX"/>
-        </w:rPr>
-      </w:pPr>
-      <w:r>
-        <w:rPr>
-          <w:rFonts w:cstheme="minorHAnsi"/>
-          <w:sz w:val="24"/>
-          <w:szCs w:val="24"/>
-          <w:lang w:val="es-MX"/>
-        </w:rPr>
-        <w:t xml:space="preserve">Como decisión de diseño clave, se utiliza una lista de coeficientes ordenados de mayor a menor grado para representar el polinomio, y se evalúa mediante la función </w:t>
-      </w:r>
-      <w:proofErr w:type="spellStart"/>
-      <w:r>
-        <w:rPr>
-          <w:rFonts w:cstheme="minorHAnsi"/>
-          <w:i/>
-          <w:iCs/>
-          <w:sz w:val="24"/>
-          <w:szCs w:val="24"/>
-          <w:lang w:val="es-MX"/>
-        </w:rPr>
-        <w:t>evaluar_polimonio</w:t>
-      </w:r>
-      <w:proofErr w:type="spellEnd"/>
-      <w:r>
-        <w:rPr>
-          <w:rFonts w:cstheme="minorHAnsi"/>
-          <w:sz w:val="24"/>
-          <w:szCs w:val="24"/>
-          <w:lang w:val="es-MX"/>
-        </w:rPr>
-        <w:t xml:space="preserve">, que aplica la suma de términos </w:t>
-      </w:r>
-      <w:r>
-        <w:rPr>
-          <w:rFonts w:cstheme="minorHAnsi"/>
-          <w:i/>
-          <w:iCs/>
-          <w:sz w:val="24"/>
-          <w:szCs w:val="24"/>
-          <w:lang w:val="es-MX"/>
-        </w:rPr>
-        <w:t xml:space="preserve">c * </w:t>
-      </w:r>
-      <w:proofErr w:type="spellStart"/>
-      <w:r>
-        <w:rPr>
-          <w:rFonts w:cstheme="minorHAnsi"/>
-          <w:i/>
-          <w:iCs/>
-          <w:sz w:val="24"/>
-          <w:szCs w:val="24"/>
-          <w:lang w:val="es-MX"/>
-        </w:rPr>
-        <w:t>x^grado</w:t>
-      </w:r>
-      <w:proofErr w:type="spellEnd"/>
-      <w:r>
-        <w:rPr>
-          <w:rFonts w:cstheme="minorHAnsi"/>
-          <w:sz w:val="24"/>
-          <w:szCs w:val="24"/>
-          <w:lang w:val="es-MX"/>
-        </w:rPr>
-        <w:t xml:space="preserve">. El núcleo del programa es la función </w:t>
-      </w:r>
-      <w:proofErr w:type="spellStart"/>
-      <w:r>
-        <w:rPr>
-          <w:rFonts w:cstheme="minorHAnsi"/>
-          <w:i/>
-          <w:iCs/>
-          <w:sz w:val="24"/>
-          <w:szCs w:val="24"/>
-          <w:lang w:val="es-MX"/>
-        </w:rPr>
-        <w:t>biseccion</w:t>
-      </w:r>
-      <w:proofErr w:type="spellEnd"/>
-      <w:r>
-        <w:rPr>
-          <w:rFonts w:cstheme="minorHAnsi"/>
-          <w:sz w:val="24"/>
-          <w:szCs w:val="24"/>
-          <w:lang w:val="es-MX"/>
-        </w:rPr>
-        <w:t>, que recibe los coeficientes, los límites del intervalo, la tolerancia y el número máximo de iteraciones, y devuelve la raíz aproximada, el número de iteraciones realizadas y una lista con el historial completo de cada iteración. Antes de aplicar el método, se verifica que exista un cambio de signo en el intervalo; si no lo hay, se lanza una excepción con un mensaje claro. Toda la entrada del usuario se valida con manejo de excepciones en utils.py, pidiendo nuevamente el dato en caso de error.</w:t>
-      </w:r>
-    </w:p>
-    <w:p>
-      <w:pPr>
-        <w:spacing w:after="120"/>
-        <w:rPr>
-          <w:rFonts w:cstheme="minorHAnsi"/>
-          <w:sz w:val="24"/>
-          <w:szCs w:val="24"/>
-          <w:lang w:val="es-MX"/>
-        </w:rPr>
-      </w:pPr>
-    </w:p>
-    <w:p>
-      <w:pPr>
-        <w:spacing w:after="120"/>
-        <w:rPr>
-          <w:rFonts w:cstheme="minorHAnsi"/>
-          <w:sz w:val="24"/>
-          <w:szCs w:val="24"/>
-          <w:lang w:val="es-MX"/>
-        </w:rPr>
-      </w:pPr>
-    </w:p>
-    <w:p>
-      <w:pPr>
-        <w:spacing w:after="120"/>
-        <w:rPr>
-          <w:rFonts w:cstheme="minorHAnsi"/>
-          <w:sz w:val="24"/>
-          <w:szCs w:val="24"/>
-          <w:lang w:val="es-MX"/>
-        </w:rPr>
-      </w:pPr>
-    </w:p>
-    <w:p>
-      <w:pPr>
-        <w:spacing w:after="120"/>
-        <w:rPr>
-          <w:rFonts w:cstheme="minorHAnsi"/>
-          <w:sz w:val="24"/>
-          <w:szCs w:val="24"/>
-          <w:lang w:val="es-MX"/>
-        </w:rPr>
-      </w:pPr>
-    </w:p>
-    <w:p>
-      <w:pPr>
-        <w:spacing w:after="120"/>
-        <w:rPr>
-          <w:rFonts w:cstheme="minorHAnsi"/>
-          <w:sz w:val="24"/>
-          <w:szCs w:val="24"/>
-          <w:lang w:val="es-MX"/>
-        </w:rPr>
-      </w:pPr>
-    </w:p>
-    <w:p>
-      <w:pPr>
-        <w:spacing w:after="120"/>
-        <w:rPr>
-          <w:rFonts w:cstheme="minorHAnsi"/>
-          <w:sz w:val="24"/>
-          <w:szCs w:val="24"/>
-          <w:lang w:val="es-MX"/>
-        </w:rPr>
-      </w:pPr>
-    </w:p>
-    <w:p>
-      <w:pPr>
-        <w:spacing w:after="120"/>
-        <w:rPr>
-          <w:rFonts w:cstheme="minorHAnsi"/>
-          <w:sz w:val="24"/>
-          <w:szCs w:val="24"/>
-          <w:lang w:val="es-MX"/>
-        </w:rPr>
-      </w:pPr>
-    </w:p>
-    <w:p>
-      <w:pPr>
-        <w:spacing w:after="120"/>
-        <w:rPr>
-          <w:rFonts w:cstheme="minorHAnsi"/>
-          <w:sz w:val="24"/>
-          <w:szCs w:val="24"/>
-          <w:lang w:val="es-MX"/>
-        </w:rPr>
-      </w:pPr>
-    </w:p>
-    <w:p>
-      <w:pPr>
-        <w:spacing w:after="120"/>
-        <w:rPr>
-          <w:rFonts w:cstheme="minorHAnsi"/>
-          <w:sz w:val="24"/>
-          <w:szCs w:val="24"/>
-          <w:lang w:val="es-MX"/>
-        </w:rPr>
-      </w:pPr>
-    </w:p>
-    <w:p>
-      <w:pPr>
-        <w:spacing w:after="120"/>
-        <w:rPr>
-          <w:rFonts w:cstheme="minorHAnsi"/>
-          <w:sz w:val="24"/>
-          <w:szCs w:val="24"/>
-          <w:lang w:val="es-MX"/>
-        </w:rPr>
-      </w:pPr>
-    </w:p>
-    <w:p>
-      <w:pPr>
-        <w:spacing w:after="120"/>
+      </w:pPr>
+      <w:r>
         <w:rPr>
           <w:rFonts w:cstheme="minorHAnsi"/>
           <w:b/>
@@ -797,16 +808,6 @@
           <w:szCs w:val="32"/>
           <w:lang w:val="es-MX"/>
         </w:rPr>
-      </w:pPr>
-      <w:r>
-        <w:rPr>
-          <w:rFonts w:cstheme="minorHAnsi"/>
-          <w:b/>
-          <w:bCs/>
-          <w:sz w:val="32"/>
-          <w:szCs w:val="32"/>
-          <w:lang w:val="es-MX"/>
-        </w:rPr>
         <w:lastRenderedPageBreak/>
         <w:t>Codificación</w:t>
       </w:r>
@@ -868,9 +869,9 @@
           <w:szCs w:val="28"/>
           <w:lang w:val="es-MX"/>
         </w:rPr>
-        <w:t>evaluar_</w:t>
-      </w:r>
-      <w:proofErr w:type="gramStart"/>
+        <w:t>evaluar_polimonio</w:t>
+      </w:r>
+      <w:proofErr w:type="spellEnd"/>
       <w:r>
         <w:rPr>
           <w:rFonts w:cstheme="minorHAnsi"/>
@@ -882,10 +883,12 @@
           <w:szCs w:val="28"/>
           <w:lang w:val="es-MX"/>
         </w:rPr>
-        <w:t>polimonio</w:t>
-      </w:r>
-      <w:proofErr w:type="spellEnd"/>
-      <w:r>
+        <w:t>(coeficientes, x)</w:t>
+      </w:r>
+    </w:p>
+    <w:p>
+      <w:pPr>
+        <w:spacing w:after="120"/>
         <w:rPr>
           <w:rFonts w:cstheme="minorHAnsi"/>
           <w:b/>
@@ -896,44 +899,15 @@
           <w:szCs w:val="28"/>
           <w:lang w:val="es-MX"/>
         </w:rPr>
-        <w:t>(</w:t>
-      </w:r>
-      <w:proofErr w:type="gramEnd"/>
-      <w:r>
-        <w:rPr>
-          <w:rFonts w:cstheme="minorHAnsi"/>
-          <w:b/>
-          <w:bCs/>
-          <w:i/>
-          <w:iCs/>
-          <w:sz w:val="28"/>
-          <w:szCs w:val="28"/>
-          <w:lang w:val="es-MX"/>
-        </w:rPr>
-        <w:t>coeficientes, x)</w:t>
-      </w:r>
-    </w:p>
-    <w:p>
-      <w:pPr>
-        <w:spacing w:after="120"/>
-        <w:rPr>
-          <w:rFonts w:cstheme="minorHAnsi"/>
-          <w:b/>
-          <w:bCs/>
-          <w:i/>
-          <w:iCs/>
-          <w:sz w:val="28"/>
-          <w:szCs w:val="28"/>
-          <w:lang w:val="es-MX"/>
-        </w:rPr>
-      </w:pPr>
-      <w:r>
-        <w:rPr>
-          <w:rFonts w:cstheme="minorHAnsi"/>
-          <w:b/>
-          <w:bCs/>
-          <w:i/>
-          <w:iCs/>
+      </w:pPr>
+      <w:r>
+        <w:rPr>
+          <w:rFonts w:cstheme="minorHAnsi"/>
+          <w:b/>
+          <w:bCs/>
+          <w:i/>
+          <w:iCs/>
+          <w:noProof/>
           <w:sz w:val="28"/>
           <w:szCs w:val="28"/>
           <w:lang w:val="es-MX"/>
@@ -954,7 +928,7 @@
                     <pic:cNvPicPr/>
                   </pic:nvPicPr>
                   <pic:blipFill>
-                    <a:blip r:embed="rId7"/>
+                    <a:blip r:embed="rId8"/>
                     <a:stretch>
                       <a:fillRect/>
                     </a:stretch>
@@ -1133,7 +1107,6 @@
         </w:rPr>
       </w:pPr>
       <w:proofErr w:type="spellStart"/>
-      <w:proofErr w:type="gramStart"/>
       <w:r>
         <w:rPr>
           <w:rFonts w:cstheme="minorHAnsi"/>
@@ -1156,9 +1129,9 @@
           <w:szCs w:val="28"/>
           <w:lang w:val="es-MX"/>
         </w:rPr>
-        <w:t>(</w:t>
-      </w:r>
-      <w:proofErr w:type="gramEnd"/>
+        <w:t xml:space="preserve">(coeficientes, </w:t>
+      </w:r>
+      <w:proofErr w:type="spellStart"/>
       <w:r>
         <w:rPr>
           <w:rFonts w:cstheme="minorHAnsi"/>
@@ -1168,9 +1141,9 @@
           <w:szCs w:val="28"/>
           <w:lang w:val="es-MX"/>
         </w:rPr>
-        <w:t xml:space="preserve">coeficientes, </w:t>
-      </w:r>
-      <w:proofErr w:type="spellStart"/>
+        <w:t>lim_izq</w:t>
+      </w:r>
+      <w:proofErr w:type="spellEnd"/>
       <w:r>
         <w:rPr>
           <w:rFonts w:cstheme="minorHAnsi"/>
@@ -1180,9 +1153,9 @@
           <w:szCs w:val="28"/>
           <w:lang w:val="es-MX"/>
         </w:rPr>
-        <w:t>lim_izq</w:t>
-      </w:r>
-      <w:proofErr w:type="spellEnd"/>
+        <w:t xml:space="preserve">, </w:t>
+      </w:r>
+      <w:proofErr w:type="spellStart"/>
       <w:r>
         <w:rPr>
           <w:rFonts w:cstheme="minorHAnsi"/>
@@ -1192,9 +1165,9 @@
           <w:szCs w:val="28"/>
           <w:lang w:val="es-MX"/>
         </w:rPr>
-        <w:t xml:space="preserve">, </w:t>
-      </w:r>
-      <w:proofErr w:type="spellStart"/>
+        <w:t>lim_der</w:t>
+      </w:r>
+      <w:proofErr w:type="spellEnd"/>
       <w:r>
         <w:rPr>
           <w:rFonts w:cstheme="minorHAnsi"/>
@@ -1204,9 +1177,9 @@
           <w:szCs w:val="28"/>
           <w:lang w:val="es-MX"/>
         </w:rPr>
-        <w:t>lim_der</w:t>
-      </w:r>
-      <w:proofErr w:type="spellEnd"/>
+        <w:t xml:space="preserve">, tolerancia=1e-6, </w:t>
+      </w:r>
+      <w:proofErr w:type="spellStart"/>
       <w:r>
         <w:rPr>
           <w:rFonts w:cstheme="minorHAnsi"/>
@@ -1216,9 +1189,9 @@
           <w:szCs w:val="28"/>
           <w:lang w:val="es-MX"/>
         </w:rPr>
-        <w:t xml:space="preserve">, tolerancia=1e-6, </w:t>
-      </w:r>
-      <w:proofErr w:type="spellStart"/>
+        <w:t>max_iter</w:t>
+      </w:r>
+      <w:proofErr w:type="spellEnd"/>
       <w:r>
         <w:rPr>
           <w:rFonts w:cstheme="minorHAnsi"/>
@@ -1228,10 +1201,12 @@
           <w:szCs w:val="28"/>
           <w:lang w:val="es-MX"/>
         </w:rPr>
-        <w:t>max_iter</w:t>
-      </w:r>
-      <w:proofErr w:type="spellEnd"/>
-      <w:r>
+        <w:t>=100)</w:t>
+      </w:r>
+    </w:p>
+    <w:p>
+      <w:pPr>
+        <w:spacing w:after="120"/>
         <w:rPr>
           <w:rFonts w:cstheme="minorHAnsi"/>
           <w:b/>
@@ -1240,8 +1215,7 @@
           <w:szCs w:val="28"/>
           <w:lang w:val="es-MX"/>
         </w:rPr>
-        <w:t>=100)</w:t>
-      </w:r>
+      </w:pPr>
     </w:p>
     <w:p>
       <w:pPr>
@@ -1255,24 +1229,12 @@
           <w:lang w:val="es-MX"/>
         </w:rPr>
       </w:pPr>
-    </w:p>
-    <w:p>
-      <w:pPr>
-        <w:spacing w:after="120"/>
-        <w:rPr>
-          <w:rFonts w:cstheme="minorHAnsi"/>
-          <w:b/>
-          <w:bCs/>
-          <w:sz w:val="28"/>
-          <w:szCs w:val="28"/>
-          <w:lang w:val="es-MX"/>
-        </w:rPr>
-      </w:pPr>
-      <w:r>
-        <w:rPr>
-          <w:rFonts w:cstheme="minorHAnsi"/>
-          <w:b/>
-          <w:bCs/>
+      <w:r>
+        <w:rPr>
+          <w:rFonts w:cstheme="minorHAnsi"/>
+          <w:b/>
+          <w:bCs/>
+          <w:noProof/>
           <w:sz w:val="28"/>
           <w:szCs w:val="28"/>
           <w:lang w:val="es-MX"/>
@@ -1293,7 +1255,7 @@
                     <pic:cNvPicPr/>
                   </pic:nvPicPr>
                   <pic:blipFill>
-                    <a:blip r:embed="rId8"/>
+                    <a:blip r:embed="rId9"/>
                     <a:stretch>
                       <a:fillRect/>
                     </a:stretch>
@@ -2241,9 +2203,9 @@
           <w:lang w:val="es-MX"/>
         </w:rPr>
         <w:lastRenderedPageBreak/>
-        <w:t>ejecutar_</w:t>
-      </w:r>
-      <w:proofErr w:type="gramStart"/>
+        <w:t>ejecutar_biseccion</w:t>
+      </w:r>
+      <w:proofErr w:type="spellEnd"/>
       <w:r>
         <w:rPr>
           <w:rFonts w:cstheme="minorHAnsi"/>
@@ -2253,10 +2215,12 @@
           <w:szCs w:val="28"/>
           <w:lang w:val="es-MX"/>
         </w:rPr>
-        <w:t>biseccion</w:t>
-      </w:r>
-      <w:proofErr w:type="spellEnd"/>
-      <w:r>
+        <w:t>()</w:t>
+      </w:r>
+    </w:p>
+    <w:p>
+      <w:pPr>
+        <w:spacing w:after="120"/>
         <w:rPr>
           <w:rFonts w:cstheme="minorHAnsi"/>
           <w:b/>
@@ -2265,38 +2229,13 @@
           <w:szCs w:val="28"/>
           <w:lang w:val="es-MX"/>
         </w:rPr>
-        <w:t>(</w:t>
-      </w:r>
-      <w:proofErr w:type="gramEnd"/>
-      <w:r>
-        <w:rPr>
-          <w:rFonts w:cstheme="minorHAnsi"/>
-          <w:b/>
-          <w:bCs/>
-          <w:sz w:val="28"/>
-          <w:szCs w:val="28"/>
-          <w:lang w:val="es-MX"/>
-        </w:rPr>
-        <w:t>)</w:t>
-      </w:r>
-    </w:p>
-    <w:p>
-      <w:pPr>
-        <w:spacing w:after="120"/>
-        <w:rPr>
-          <w:rFonts w:cstheme="minorHAnsi"/>
-          <w:b/>
-          <w:bCs/>
-          <w:sz w:val="28"/>
-          <w:szCs w:val="28"/>
-          <w:lang w:val="es-MX"/>
-        </w:rPr>
-      </w:pPr>
-      <w:r>
-        <w:rPr>
-          <w:rFonts w:cstheme="minorHAnsi"/>
-          <w:b/>
-          <w:bCs/>
+      </w:pPr>
+      <w:r>
+        <w:rPr>
+          <w:rFonts w:cstheme="minorHAnsi"/>
+          <w:b/>
+          <w:bCs/>
+          <w:noProof/>
           <w:sz w:val="28"/>
           <w:szCs w:val="28"/>
           <w:lang w:val="es-MX"/>
@@ -2317,7 +2256,7 @@
                     <pic:cNvPicPr/>
                   </pic:nvPicPr>
                   <pic:blipFill>
-                    <a:blip r:embed="rId9"/>
+                    <a:blip r:embed="rId10"/>
                     <a:stretch>
                       <a:fillRect/>
                     </a:stretch>
@@ -2577,19 +2516,7 @@
           <w:szCs w:val="24"/>
           <w:lang w:val="es-MX"/>
         </w:rPr>
-        <w:t>leer_</w:t>
-      </w:r>
-      <w:proofErr w:type="gramStart"/>
-      <w:r>
-        <w:rPr>
-          <w:rFonts w:cstheme="minorHAnsi"/>
-          <w:i/>
-          <w:iCs/>
-          <w:sz w:val="24"/>
-          <w:szCs w:val="24"/>
-          <w:lang w:val="es-MX"/>
-        </w:rPr>
-        <w:t>opcion</w:t>
+        <w:t>leer_opcion</w:t>
       </w:r>
       <w:proofErr w:type="spellEnd"/>
       <w:r>
@@ -2604,7 +2531,6 @@
         <w:t>(</w:t>
       </w:r>
       <w:proofErr w:type="spellStart"/>
-      <w:proofErr w:type="gramEnd"/>
       <w:r>
         <w:rPr>
           <w:rFonts w:cstheme="minorHAnsi"/>
@@ -2695,6 +2621,7 @@
           <w:rFonts w:cstheme="minorHAnsi"/>
           <w:i/>
           <w:iCs/>
+          <w:noProof/>
           <w:sz w:val="24"/>
           <w:szCs w:val="24"/>
           <w:lang w:val="es-MX"/>
@@ -2715,7 +2642,7 @@
                     <pic:cNvPicPr/>
                   </pic:nvPicPr>
                   <pic:blipFill>
-                    <a:blip r:embed="rId10"/>
+                    <a:blip r:embed="rId11"/>
                     <a:stretch>
                       <a:fillRect/>
                     </a:stretch>
@@ -2819,6 +2746,7 @@
           <w:rFonts w:cstheme="minorHAnsi"/>
           <w:i/>
           <w:iCs/>
+          <w:noProof/>
           <w:sz w:val="24"/>
           <w:szCs w:val="24"/>
           <w:lang w:val="es-MX"/>
@@ -2839,7 +2767,7 @@
                     <pic:cNvPicPr/>
                   </pic:nvPicPr>
                   <pic:blipFill>
-                    <a:blip r:embed="rId11"/>
+                    <a:blip r:embed="rId12"/>
                     <a:stretch>
                       <a:fillRect/>
                     </a:stretch>
@@ -2967,6 +2895,7 @@
           <w:rFonts w:cstheme="minorHAnsi"/>
           <w:i/>
           <w:iCs/>
+          <w:noProof/>
           <w:sz w:val="24"/>
           <w:szCs w:val="24"/>
           <w:lang w:val="es-MX"/>
@@ -2988,7 +2917,7 @@
                     <pic:cNvPicPr/>
                   </pic:nvPicPr>
                   <pic:blipFill>
-                    <a:blip r:embed="rId12"/>
+                    <a:blip r:embed="rId13"/>
                     <a:stretch>
                       <a:fillRect/>
                     </a:stretch>
@@ -3035,43 +2964,19 @@
           <w:szCs w:val="24"/>
           <w:lang w:val="es-MX"/>
         </w:rPr>
-        <w:t>borrar_</w:t>
-      </w:r>
-      <w:proofErr w:type="gramStart"/>
-      <w:r>
-        <w:rPr>
-          <w:rFonts w:cstheme="minorHAnsi"/>
-          <w:i/>
-          <w:iCs/>
-          <w:sz w:val="24"/>
-          <w:szCs w:val="24"/>
-          <w:lang w:val="es-MX"/>
-        </w:rPr>
-        <w:t>consola</w:t>
-      </w:r>
-      <w:proofErr w:type="spellEnd"/>
-      <w:r>
-        <w:rPr>
-          <w:rFonts w:cstheme="minorHAnsi"/>
-          <w:i/>
-          <w:iCs/>
-          <w:sz w:val="24"/>
-          <w:szCs w:val="24"/>
-          <w:lang w:val="es-MX"/>
-        </w:rPr>
-        <w:t>(</w:t>
-      </w:r>
-      <w:proofErr w:type="gramEnd"/>
-      <w:r>
-        <w:rPr>
-          <w:rFonts w:cstheme="minorHAnsi"/>
-          <w:i/>
-          <w:iCs/>
-          <w:sz w:val="24"/>
-          <w:szCs w:val="24"/>
-          <w:lang w:val="es-MX"/>
-        </w:rPr>
-        <w:t xml:space="preserve">): limpia la pantalla según el sistema operativo (Windows: </w:t>
+        <w:t>borrar_consola</w:t>
+      </w:r>
+      <w:proofErr w:type="spellEnd"/>
+      <w:r>
+        <w:rPr>
+          <w:rFonts w:cstheme="minorHAnsi"/>
+          <w:i/>
+          <w:iCs/>
+          <w:sz w:val="24"/>
+          <w:szCs w:val="24"/>
+          <w:lang w:val="es-MX"/>
+        </w:rPr>
+        <w:t xml:space="preserve">(): limpia la pantalla según el sistema operativo (Windows: </w:t>
       </w:r>
       <w:proofErr w:type="spellStart"/>
       <w:r>
@@ -3122,65 +3027,28 @@
         <w:t>), pero solo si la entrada es una terminal interactiva (</w:t>
       </w:r>
       <w:proofErr w:type="spellStart"/>
-      <w:proofErr w:type="gramStart"/>
-      <w:r>
-        <w:rPr>
-          <w:rFonts w:cstheme="minorHAnsi"/>
-          <w:i/>
-          <w:iCs/>
-          <w:sz w:val="24"/>
-          <w:szCs w:val="24"/>
-          <w:lang w:val="es-MX"/>
-        </w:rPr>
-        <w:t>sys.stdin</w:t>
-      </w:r>
-      <w:proofErr w:type="gramEnd"/>
-      <w:r>
-        <w:rPr>
-          <w:rFonts w:cstheme="minorHAnsi"/>
-          <w:i/>
-          <w:iCs/>
-          <w:sz w:val="24"/>
-          <w:szCs w:val="24"/>
-          <w:lang w:val="es-MX"/>
-        </w:rPr>
-        <w:t>.</w:t>
-      </w:r>
-      <w:proofErr w:type="gramStart"/>
-      <w:r>
-        <w:rPr>
-          <w:rFonts w:cstheme="minorHAnsi"/>
-          <w:i/>
-          <w:iCs/>
-          <w:sz w:val="24"/>
-          <w:szCs w:val="24"/>
-          <w:lang w:val="es-MX"/>
-        </w:rPr>
-        <w:t>isatty</w:t>
-      </w:r>
-      <w:proofErr w:type="spellEnd"/>
-      <w:r>
-        <w:rPr>
-          <w:rFonts w:cstheme="minorHAnsi"/>
-          <w:i/>
-          <w:iCs/>
-          <w:sz w:val="24"/>
-          <w:szCs w:val="24"/>
-          <w:lang w:val="es-MX"/>
-        </w:rPr>
-        <w:t>(</w:t>
-      </w:r>
-      <w:proofErr w:type="gramEnd"/>
-      <w:r>
-        <w:rPr>
-          <w:rFonts w:cstheme="minorHAnsi"/>
-          <w:i/>
-          <w:iCs/>
-          <w:sz w:val="24"/>
-          <w:szCs w:val="24"/>
-          <w:lang w:val="es-MX"/>
-        </w:rPr>
-        <w:t>)).</w:t>
+      <w:r>
+        <w:rPr>
+          <w:rFonts w:cstheme="minorHAnsi"/>
+          <w:i/>
+          <w:iCs/>
+          <w:sz w:val="24"/>
+          <w:szCs w:val="24"/>
+          <w:lang w:val="es-MX"/>
+        </w:rPr>
+        <w:t>sys.stdin.isatty</w:t>
+      </w:r>
+      <w:proofErr w:type="spellEnd"/>
+      <w:r>
+        <w:rPr>
+          <w:rFonts w:cstheme="minorHAnsi"/>
+          <w:i/>
+          <w:iCs/>
+          <w:sz w:val="24"/>
+          <w:szCs w:val="24"/>
+          <w:lang w:val="es-MX"/>
+        </w:rPr>
+        <w:t>()).</w:t>
       </w:r>
     </w:p>
     <w:p>
@@ -3201,6 +3069,7 @@
           <w:rFonts w:cstheme="minorHAnsi"/>
           <w:i/>
           <w:iCs/>
+          <w:noProof/>
           <w:sz w:val="24"/>
           <w:szCs w:val="24"/>
           <w:lang w:val="es-MX"/>
@@ -3221,7 +3090,7 @@
                     <pic:cNvPicPr/>
                   </pic:nvPicPr>
                   <pic:blipFill>
-                    <a:blip r:embed="rId13"/>
+                    <a:blip r:embed="rId14"/>
                     <a:stretch>
                       <a:fillRect/>
                     </a:stretch>
@@ -3258,29 +3127,16 @@
           <w:lang w:val="es-MX"/>
         </w:rPr>
       </w:pPr>
-      <w:proofErr w:type="gramStart"/>
-      <w:r>
-        <w:rPr>
-          <w:rFonts w:cstheme="minorHAnsi"/>
-          <w:i/>
-          <w:iCs/>
-          <w:sz w:val="24"/>
-          <w:szCs w:val="24"/>
-          <w:lang w:val="es-MX"/>
-        </w:rPr>
-        <w:t>pausar(</w:t>
-      </w:r>
-      <w:proofErr w:type="gramEnd"/>
-      <w:r>
-        <w:rPr>
-          <w:rFonts w:cstheme="minorHAnsi"/>
-          <w:i/>
-          <w:iCs/>
-          <w:sz w:val="24"/>
-          <w:szCs w:val="24"/>
-          <w:lang w:val="es-MX"/>
-        </w:rPr>
-        <w:t>): simula el comando pause de Windows o espera un Enter en otros sistemas, también solo en terminal interactiva.</w:t>
+      <w:r>
+        <w:rPr>
+          <w:rFonts w:cstheme="minorHAnsi"/>
+          <w:i/>
+          <w:iCs/>
+          <w:sz w:val="24"/>
+          <w:szCs w:val="24"/>
+          <w:lang w:val="es-MX"/>
+        </w:rPr>
+        <w:t>pausar(): simula el comando pause de Windows o espera un Enter en otros sistemas, también solo en terminal interactiva.</w:t>
       </w:r>
     </w:p>
     <w:p>
@@ -3301,6 +3157,7 @@
           <w:rFonts w:cstheme="minorHAnsi"/>
           <w:i/>
           <w:iCs/>
+          <w:noProof/>
           <w:sz w:val="24"/>
           <w:szCs w:val="24"/>
           <w:lang w:val="es-MX"/>
@@ -3321,7 +3178,7 @@
                     <pic:cNvPicPr/>
                   </pic:nvPicPr>
                   <pic:blipFill>
-                    <a:blip r:embed="rId14"/>
+                    <a:blip r:embed="rId15"/>
                     <a:stretch>
                       <a:fillRect/>
                     </a:stretch>
@@ -3438,27 +3295,7 @@
           <w:szCs w:val="24"/>
           <w:lang w:val="es-MX"/>
         </w:rPr>
-        <w:t xml:space="preserve">main.py (o el script de ejecución) llama a </w:t>
-      </w:r>
-      <w:proofErr w:type="gramStart"/>
-      <w:r>
-        <w:rPr>
-          <w:rFonts w:cstheme="minorHAnsi"/>
-          <w:sz w:val="24"/>
-          <w:szCs w:val="24"/>
-          <w:lang w:val="es-MX"/>
-        </w:rPr>
-        <w:t>run(</w:t>
-      </w:r>
-      <w:proofErr w:type="gramEnd"/>
-      <w:r>
-        <w:rPr>
-          <w:rFonts w:cstheme="minorHAnsi"/>
-          <w:sz w:val="24"/>
-          <w:szCs w:val="24"/>
-          <w:lang w:val="es-MX"/>
-        </w:rPr>
-        <w:t xml:space="preserve">) del módulo </w:t>
+        <w:t xml:space="preserve">main.py (o el script de ejecución) llama a run() del módulo </w:t>
       </w:r>
       <w:proofErr w:type="spellStart"/>
       <w:r>
@@ -3495,65 +3332,34 @@
           <w:lang w:val="es-MX"/>
         </w:rPr>
       </w:pPr>
-      <w:proofErr w:type="gramStart"/>
-      <w:r>
-        <w:rPr>
-          <w:rFonts w:cstheme="minorHAnsi"/>
-          <w:sz w:val="24"/>
-          <w:szCs w:val="24"/>
-          <w:lang w:val="es-MX"/>
-        </w:rPr>
-        <w:t>run(</w:t>
-      </w:r>
-      <w:proofErr w:type="gramEnd"/>
-      <w:r>
-        <w:rPr>
-          <w:rFonts w:cstheme="minorHAnsi"/>
-          <w:sz w:val="24"/>
-          <w:szCs w:val="24"/>
-          <w:lang w:val="es-MX"/>
-        </w:rPr>
-        <w:t xml:space="preserve">) muestra el menú y, si se elige la opción 1, llama a </w:t>
-      </w:r>
-      <w:proofErr w:type="spellStart"/>
-      <w:r>
-        <w:rPr>
-          <w:rFonts w:cstheme="minorHAnsi"/>
-          <w:sz w:val="24"/>
-          <w:szCs w:val="24"/>
-          <w:lang w:val="es-MX"/>
-        </w:rPr>
-        <w:t>ejecutar_</w:t>
-      </w:r>
-      <w:proofErr w:type="gramStart"/>
-      <w:r>
-        <w:rPr>
-          <w:rFonts w:cstheme="minorHAnsi"/>
-          <w:sz w:val="24"/>
-          <w:szCs w:val="24"/>
-          <w:lang w:val="es-MX"/>
-        </w:rPr>
-        <w:t>biseccion</w:t>
-      </w:r>
-      <w:proofErr w:type="spellEnd"/>
-      <w:r>
-        <w:rPr>
-          <w:rFonts w:cstheme="minorHAnsi"/>
-          <w:sz w:val="24"/>
-          <w:szCs w:val="24"/>
-          <w:lang w:val="es-MX"/>
-        </w:rPr>
-        <w:t>(</w:t>
-      </w:r>
-      <w:proofErr w:type="gramEnd"/>
-      <w:r>
-        <w:rPr>
-          <w:rFonts w:cstheme="minorHAnsi"/>
-          <w:sz w:val="24"/>
-          <w:szCs w:val="24"/>
-          <w:lang w:val="es-MX"/>
-        </w:rPr>
-        <w:t xml:space="preserve">) del módulo </w:t>
+      <w:r>
+        <w:rPr>
+          <w:rFonts w:cstheme="minorHAnsi"/>
+          <w:sz w:val="24"/>
+          <w:szCs w:val="24"/>
+          <w:lang w:val="es-MX"/>
+        </w:rPr>
+        <w:t xml:space="preserve">run() muestra el menú y, si se elige la opción 1, llama a </w:t>
+      </w:r>
+      <w:proofErr w:type="spellStart"/>
+      <w:r>
+        <w:rPr>
+          <w:rFonts w:cstheme="minorHAnsi"/>
+          <w:sz w:val="24"/>
+          <w:szCs w:val="24"/>
+          <w:lang w:val="es-MX"/>
+        </w:rPr>
+        <w:t>ejecutar_biseccion</w:t>
+      </w:r>
+      <w:proofErr w:type="spellEnd"/>
+      <w:r>
+        <w:rPr>
+          <w:rFonts w:cstheme="minorHAnsi"/>
+          <w:sz w:val="24"/>
+          <w:szCs w:val="24"/>
+          <w:lang w:val="es-MX"/>
+        </w:rPr>
+        <w:t xml:space="preserve">() del módulo </w:t>
       </w:r>
       <w:proofErr w:type="spellStart"/>
       <w:r>
@@ -3598,9 +3404,59 @@
           <w:szCs w:val="24"/>
           <w:lang w:val="es-MX"/>
         </w:rPr>
-        <w:t>ejecutar_</w:t>
-      </w:r>
-      <w:proofErr w:type="gramStart"/>
+        <w:t>ejecutar_biseccion</w:t>
+      </w:r>
+      <w:proofErr w:type="spellEnd"/>
+      <w:r>
+        <w:rPr>
+          <w:rFonts w:cstheme="minorHAnsi"/>
+          <w:sz w:val="24"/>
+          <w:szCs w:val="24"/>
+          <w:lang w:val="es-MX"/>
+        </w:rPr>
+        <w:t xml:space="preserve">() solicita los datos al usuario usando </w:t>
+      </w:r>
+      <w:proofErr w:type="spellStart"/>
+      <w:r>
+        <w:rPr>
+          <w:rFonts w:cstheme="minorHAnsi"/>
+          <w:sz w:val="24"/>
+          <w:szCs w:val="24"/>
+          <w:lang w:val="es-MX"/>
+        </w:rPr>
+        <w:t>leer_real</w:t>
+      </w:r>
+      <w:proofErr w:type="spellEnd"/>
+      <w:r>
+        <w:rPr>
+          <w:rFonts w:cstheme="minorHAnsi"/>
+          <w:sz w:val="24"/>
+          <w:szCs w:val="24"/>
+          <w:lang w:val="es-MX"/>
+        </w:rPr>
+        <w:t xml:space="preserve"> de </w:t>
+      </w:r>
+      <w:proofErr w:type="spellStart"/>
+      <w:r>
+        <w:rPr>
+          <w:rFonts w:cstheme="minorHAnsi"/>
+          <w:sz w:val="24"/>
+          <w:szCs w:val="24"/>
+          <w:lang w:val="es-MX"/>
+        </w:rPr>
+        <w:t>utils</w:t>
+      </w:r>
+      <w:proofErr w:type="spellEnd"/>
+      <w:r>
+        <w:rPr>
+          <w:rFonts w:cstheme="minorHAnsi"/>
+          <w:sz w:val="24"/>
+          <w:szCs w:val="24"/>
+          <w:lang w:val="es-MX"/>
+        </w:rPr>
+        <w:t xml:space="preserve">, valida los coeficientes y el intervalo, y llama a </w:t>
+      </w:r>
+      <w:proofErr w:type="spellStart"/>
       <w:r>
         <w:rPr>
           <w:rFonts w:cstheme="minorHAnsi"/>
@@ -3618,88 +3474,7 @@
           <w:szCs w:val="24"/>
           <w:lang w:val="es-MX"/>
         </w:rPr>
-        <w:t>(</w:t>
-      </w:r>
-      <w:proofErr w:type="gramEnd"/>
-      <w:r>
-        <w:rPr>
-          <w:rFonts w:cstheme="minorHAnsi"/>
-          <w:sz w:val="24"/>
-          <w:szCs w:val="24"/>
-          <w:lang w:val="es-MX"/>
-        </w:rPr>
-        <w:t xml:space="preserve">) solicita los datos al usuario usando </w:t>
-      </w:r>
-      <w:proofErr w:type="spellStart"/>
-      <w:r>
-        <w:rPr>
-          <w:rFonts w:cstheme="minorHAnsi"/>
-          <w:sz w:val="24"/>
-          <w:szCs w:val="24"/>
-          <w:lang w:val="es-MX"/>
-        </w:rPr>
-        <w:t>leer_real</w:t>
-      </w:r>
-      <w:proofErr w:type="spellEnd"/>
-      <w:r>
-        <w:rPr>
-          <w:rFonts w:cstheme="minorHAnsi"/>
-          <w:sz w:val="24"/>
-          <w:szCs w:val="24"/>
-          <w:lang w:val="es-MX"/>
-        </w:rPr>
-        <w:t xml:space="preserve"> de </w:t>
-      </w:r>
-      <w:proofErr w:type="spellStart"/>
-      <w:r>
-        <w:rPr>
-          <w:rFonts w:cstheme="minorHAnsi"/>
-          <w:sz w:val="24"/>
-          <w:szCs w:val="24"/>
-          <w:lang w:val="es-MX"/>
-        </w:rPr>
-        <w:t>utils</w:t>
-      </w:r>
-      <w:proofErr w:type="spellEnd"/>
-      <w:r>
-        <w:rPr>
-          <w:rFonts w:cstheme="minorHAnsi"/>
-          <w:sz w:val="24"/>
-          <w:szCs w:val="24"/>
-          <w:lang w:val="es-MX"/>
-        </w:rPr>
-        <w:t xml:space="preserve">, valida los coeficientes y el intervalo, y llama a </w:t>
-      </w:r>
-      <w:proofErr w:type="spellStart"/>
-      <w:proofErr w:type="gramStart"/>
-      <w:r>
-        <w:rPr>
-          <w:rFonts w:cstheme="minorHAnsi"/>
-          <w:sz w:val="24"/>
-          <w:szCs w:val="24"/>
-          <w:lang w:val="es-MX"/>
-        </w:rPr>
-        <w:t>biseccion</w:t>
-      </w:r>
-      <w:proofErr w:type="spellEnd"/>
-      <w:r>
-        <w:rPr>
-          <w:rFonts w:cstheme="minorHAnsi"/>
-          <w:sz w:val="24"/>
-          <w:szCs w:val="24"/>
-          <w:lang w:val="es-MX"/>
-        </w:rPr>
-        <w:t>(</w:t>
-      </w:r>
-      <w:proofErr w:type="gramEnd"/>
-      <w:r>
-        <w:rPr>
-          <w:rFonts w:cstheme="minorHAnsi"/>
-          <w:sz w:val="24"/>
-          <w:szCs w:val="24"/>
-          <w:lang w:val="es-MX"/>
-        </w:rPr>
-        <w:t>).</w:t>
+        <w:t>().</w:t>
       </w:r>
     </w:p>
     <w:p>
@@ -3717,7 +3492,6 @@
         </w:rPr>
       </w:pPr>
       <w:proofErr w:type="spellStart"/>
-      <w:proofErr w:type="gramStart"/>
       <w:r>
         <w:rPr>
           <w:rFonts w:cstheme="minorHAnsi"/>
@@ -3736,57 +3510,27 @@
           <w:szCs w:val="24"/>
           <w:lang w:val="es-MX"/>
         </w:rPr>
-        <w:t>(</w:t>
-      </w:r>
-      <w:proofErr w:type="gramEnd"/>
-      <w:r>
-        <w:rPr>
-          <w:rFonts w:cstheme="minorHAnsi"/>
-          <w:sz w:val="24"/>
-          <w:szCs w:val="24"/>
-          <w:lang w:val="es-MX"/>
-        </w:rPr>
-        <w:t xml:space="preserve">) utiliza </w:t>
-      </w:r>
-      <w:proofErr w:type="spellStart"/>
-      <w:r>
-        <w:rPr>
-          <w:rFonts w:cstheme="minorHAnsi"/>
-          <w:sz w:val="24"/>
-          <w:szCs w:val="24"/>
-          <w:lang w:val="es-MX"/>
-        </w:rPr>
-        <w:t>evaluar_</w:t>
-      </w:r>
-      <w:proofErr w:type="gramStart"/>
-      <w:r>
-        <w:rPr>
-          <w:rFonts w:cstheme="minorHAnsi"/>
-          <w:sz w:val="24"/>
-          <w:szCs w:val="24"/>
-          <w:lang w:val="es-MX"/>
-        </w:rPr>
-        <w:t>polimonio</w:t>
-      </w:r>
-      <w:proofErr w:type="spellEnd"/>
-      <w:r>
-        <w:rPr>
-          <w:rFonts w:cstheme="minorHAnsi"/>
-          <w:sz w:val="24"/>
-          <w:szCs w:val="24"/>
-          <w:lang w:val="es-MX"/>
-        </w:rPr>
-        <w:t>(</w:t>
-      </w:r>
-      <w:proofErr w:type="gramEnd"/>
-      <w:r>
-        <w:rPr>
-          <w:rFonts w:cstheme="minorHAnsi"/>
-          <w:sz w:val="24"/>
-          <w:szCs w:val="24"/>
-          <w:lang w:val="es-MX"/>
-        </w:rPr>
-        <w:t>) para calcular los valores de f y ejecuta el algoritmo, devolviendo la raíz, el número de iteraciones y el historial.</w:t>
+        <w:t xml:space="preserve">() utiliza </w:t>
+      </w:r>
+      <w:proofErr w:type="spellStart"/>
+      <w:r>
+        <w:rPr>
+          <w:rFonts w:cstheme="minorHAnsi"/>
+          <w:sz w:val="24"/>
+          <w:szCs w:val="24"/>
+          <w:lang w:val="es-MX"/>
+        </w:rPr>
+        <w:t>evaluar_polimonio</w:t>
+      </w:r>
+      <w:proofErr w:type="spellEnd"/>
+      <w:r>
+        <w:rPr>
+          <w:rFonts w:cstheme="minorHAnsi"/>
+          <w:sz w:val="24"/>
+          <w:szCs w:val="24"/>
+          <w:lang w:val="es-MX"/>
+        </w:rPr>
+        <w:t>() para calcular los valores de f y ejecuta el algoritmo, devolviendo la raíz, el número de iteraciones y el historial.</w:t>
       </w:r>
     </w:p>
     <w:p>
@@ -3811,37 +3555,17 @@
           <w:szCs w:val="24"/>
           <w:lang w:val="es-MX"/>
         </w:rPr>
-        <w:t>ejecutar_</w:t>
-      </w:r>
-      <w:proofErr w:type="gramStart"/>
-      <w:r>
-        <w:rPr>
-          <w:rFonts w:cstheme="minorHAnsi"/>
-          <w:sz w:val="24"/>
-          <w:szCs w:val="24"/>
-          <w:lang w:val="es-MX"/>
-        </w:rPr>
-        <w:t>biseccion</w:t>
-      </w:r>
-      <w:proofErr w:type="spellEnd"/>
-      <w:r>
-        <w:rPr>
-          <w:rFonts w:cstheme="minorHAnsi"/>
-          <w:sz w:val="24"/>
-          <w:szCs w:val="24"/>
-          <w:lang w:val="es-MX"/>
-        </w:rPr>
-        <w:t>(</w:t>
-      </w:r>
-      <w:proofErr w:type="gramEnd"/>
-      <w:r>
-        <w:rPr>
-          <w:rFonts w:cstheme="minorHAnsi"/>
-          <w:sz w:val="24"/>
-          <w:szCs w:val="24"/>
-          <w:lang w:val="es-MX"/>
-        </w:rPr>
-        <w:t>) muestra los resultados y la tabla de iteraciones.</w:t>
+        <w:t>ejecutar_biseccion</w:t>
+      </w:r>
+      <w:proofErr w:type="spellEnd"/>
+      <w:r>
+        <w:rPr>
+          <w:rFonts w:cstheme="minorHAnsi"/>
+          <w:sz w:val="24"/>
+          <w:szCs w:val="24"/>
+          <w:lang w:val="es-MX"/>
+        </w:rPr>
+        <w:t>() muestra los resultados y la tabla de iteraciones.</w:t>
       </w:r>
     </w:p>
     <w:p>
@@ -3858,25 +3582,14 @@
           <w:lang w:val="es-MX"/>
         </w:rPr>
       </w:pPr>
-      <w:proofErr w:type="gramStart"/>
-      <w:r>
-        <w:rPr>
-          <w:rFonts w:cstheme="minorHAnsi"/>
-          <w:sz w:val="24"/>
-          <w:szCs w:val="24"/>
-          <w:lang w:val="es-MX"/>
-        </w:rPr>
-        <w:t>run(</w:t>
-      </w:r>
-      <w:proofErr w:type="gramEnd"/>
-      <w:r>
-        <w:rPr>
-          <w:rFonts w:cstheme="minorHAnsi"/>
-          <w:sz w:val="24"/>
-          <w:szCs w:val="24"/>
-          <w:lang w:val="es-MX"/>
-        </w:rPr>
-        <w:t>) pausa la pantalla y vuelve al menú hasta que el usuario elija salir.</w:t>
+      <w:r>
+        <w:rPr>
+          <w:rFonts w:cstheme="minorHAnsi"/>
+          <w:sz w:val="24"/>
+          <w:szCs w:val="24"/>
+          <w:lang w:val="es-MX"/>
+        </w:rPr>
+        <w:t>run() pausa la pantalla y vuelve al menú hasta que el usuario elija salir.</w:t>
       </w:r>
     </w:p>
     <w:p>
@@ -3942,11 +3655,244 @@
     </w:p>
     <w:p>
       <w:pPr>
-        <w:rPr>
-          <w:lang w:val="es-MX"/>
-        </w:rPr>
-      </w:pPr>
-      <w:r>
+        <w:pStyle w:val="Ttulo2"/>
+        <w:rPr>
+          <w:lang w:val="es-MX"/>
+        </w:rPr>
+      </w:pPr>
+      <w:r>
+        <w:rPr>
+          <w:lang w:val="es-MX"/>
+        </w:rPr>
+        <w:t>Evaluar Polinomio</w:t>
+      </w:r>
+    </w:p>
+    <w:p>
+      <w:pPr>
+        <w:jc w:val="center"/>
+        <w:rPr>
+          <w:lang w:val="es-MX"/>
+        </w:rPr>
+      </w:pPr>
+      <w:r>
+        <w:rPr>
+          <w:noProof/>
+          <w:lang w:val="es-MX"/>
+        </w:rPr>
+        <w:drawing>
+          <wp:inline distT="0" distB="0" distL="0" distR="0" wp14:anchorId="69B1A1DA" wp14:editId="73DE5F52">
+            <wp:extent cx="2057400" cy="3353950"/>
+            <wp:effectExtent l="0" t="0" r="0" b="0"/>
+            <wp:docPr id="388547408" name="Imagen 1"/>
+            <wp:cNvGraphicFramePr>
+              <a:graphicFrameLocks xmlns:a="http://schemas.openxmlformats.org/drawingml/2006/main" noChangeAspect="1"/>
+            </wp:cNvGraphicFramePr>
+            <a:graphic xmlns:a="http://schemas.openxmlformats.org/drawingml/2006/main">
+              <a:graphicData uri="http://schemas.openxmlformats.org/drawingml/2006/picture">
+                <pic:pic xmlns:pic="http://schemas.openxmlformats.org/drawingml/2006/picture">
+                  <pic:nvPicPr>
+                    <pic:cNvPr id="0" name="Picture 1"/>
+                    <pic:cNvPicPr>
+                      <a:picLocks noChangeAspect="1" noChangeArrowheads="1"/>
+                    </pic:cNvPicPr>
+                  </pic:nvPicPr>
+                  <pic:blipFill>
+                    <a:blip r:embed="rId16" cstate="print">
+                      <a:extLst>
+                        <a:ext uri="{28A0092B-C50C-407E-A947-70E740481C1C}">
+                          <a14:useLocalDpi xmlns:a14="http://schemas.microsoft.com/office/drawing/2010/main" val="0"/>
+                        </a:ext>
+                      </a:extLst>
+                    </a:blip>
+                    <a:srcRect/>
+                    <a:stretch>
+                      <a:fillRect/>
+                    </a:stretch>
+                  </pic:blipFill>
+                  <pic:spPr bwMode="auto">
+                    <a:xfrm>
+                      <a:off x="0" y="0"/>
+                      <a:ext cx="2063524" cy="3363934"/>
+                    </a:xfrm>
+                    <a:prstGeom prst="rect">
+                      <a:avLst/>
+                    </a:prstGeom>
+                    <a:noFill/>
+                    <a:ln>
+                      <a:noFill/>
+                    </a:ln>
+                  </pic:spPr>
+                </pic:pic>
+              </a:graphicData>
+            </a:graphic>
+          </wp:inline>
+        </w:drawing>
+      </w:r>
+    </w:p>
+    <w:p>
+      <w:pPr>
+        <w:pStyle w:val="Ttulo2"/>
+        <w:rPr>
+          <w:lang w:val="es-MX"/>
+        </w:rPr>
+      </w:pPr>
+      <w:r>
+        <w:rPr>
+          <w:lang w:val="es-MX"/>
+        </w:rPr>
+        <w:lastRenderedPageBreak/>
+        <w:t>Bisección</w:t>
+      </w:r>
+    </w:p>
+    <w:p>
+      <w:pPr>
+        <w:jc w:val="center"/>
+        <w:rPr>
+          <w:lang w:val="es-MX"/>
+        </w:rPr>
+      </w:pPr>
+      <w:r>
+        <w:rPr>
+          <w:noProof/>
+          <w:lang w:val="es-MX"/>
+        </w:rPr>
+        <w:drawing>
+          <wp:inline distT="0" distB="0" distL="0" distR="0" wp14:anchorId="2DEDF0C9" wp14:editId="13AA87D0">
+            <wp:extent cx="7393837" cy="5777592"/>
+            <wp:effectExtent l="7938" t="0" r="6032" b="6033"/>
+            <wp:docPr id="1450425004" name="Imagen 2"/>
+            <wp:cNvGraphicFramePr>
+              <a:graphicFrameLocks xmlns:a="http://schemas.openxmlformats.org/drawingml/2006/main" noChangeAspect="1"/>
+            </wp:cNvGraphicFramePr>
+            <a:graphic xmlns:a="http://schemas.openxmlformats.org/drawingml/2006/main">
+              <a:graphicData uri="http://schemas.openxmlformats.org/drawingml/2006/picture">
+                <pic:pic xmlns:pic="http://schemas.openxmlformats.org/drawingml/2006/picture">
+                  <pic:nvPicPr>
+                    <pic:cNvPr id="0" name="Picture 2"/>
+                    <pic:cNvPicPr>
+                      <a:picLocks noChangeAspect="1" noChangeArrowheads="1"/>
+                    </pic:cNvPicPr>
+                  </pic:nvPicPr>
+                  <pic:blipFill>
+                    <a:blip r:embed="rId17" cstate="print">
+                      <a:extLst>
+                        <a:ext uri="{28A0092B-C50C-407E-A947-70E740481C1C}">
+                          <a14:useLocalDpi xmlns:a14="http://schemas.microsoft.com/office/drawing/2010/main" val="0"/>
+                        </a:ext>
+                      </a:extLst>
+                    </a:blip>
+                    <a:srcRect/>
+                    <a:stretch>
+                      <a:fillRect/>
+                    </a:stretch>
+                  </pic:blipFill>
+                  <pic:spPr bwMode="auto">
+                    <a:xfrm rot="16200000">
+                      <a:off x="0" y="0"/>
+                      <a:ext cx="7439783" cy="5813495"/>
+                    </a:xfrm>
+                    <a:prstGeom prst="rect">
+                      <a:avLst/>
+                    </a:prstGeom>
+                    <a:noFill/>
+                    <a:ln>
+                      <a:noFill/>
+                    </a:ln>
+                  </pic:spPr>
+                </pic:pic>
+              </a:graphicData>
+            </a:graphic>
+          </wp:inline>
+        </w:drawing>
+      </w:r>
+    </w:p>
+    <w:p>
+      <w:pPr>
+        <w:pStyle w:val="Ttulo2"/>
+        <w:rPr>
+          <w:lang w:val="es-MX"/>
+        </w:rPr>
+      </w:pPr>
+      <w:r>
+        <w:rPr>
+          <w:lang w:val="es-MX"/>
+        </w:rPr>
+        <w:lastRenderedPageBreak/>
+        <w:t>Ejecutar bisección</w:t>
+      </w:r>
+    </w:p>
+    <w:p>
+      <w:pPr>
+        <w:jc w:val="center"/>
+        <w:rPr>
+          <w:lang w:val="es-MX"/>
+        </w:rPr>
+      </w:pPr>
+      <w:r>
+        <w:rPr>
+          <w:noProof/>
+          <w:lang w:val="es-MX"/>
+        </w:rPr>
+        <w:drawing>
+          <wp:inline distT="0" distB="0" distL="0" distR="0" wp14:anchorId="084AC31F" wp14:editId="54382C08">
+            <wp:extent cx="2972116" cy="4286992"/>
+            <wp:effectExtent l="0" t="0" r="0" b="0"/>
+            <wp:docPr id="1903652788" name="Imagen 3"/>
+            <wp:cNvGraphicFramePr>
+              <a:graphicFrameLocks xmlns:a="http://schemas.openxmlformats.org/drawingml/2006/main" noChangeAspect="1"/>
+            </wp:cNvGraphicFramePr>
+            <a:graphic xmlns:a="http://schemas.openxmlformats.org/drawingml/2006/main">
+              <a:graphicData uri="http://schemas.openxmlformats.org/drawingml/2006/picture">
+                <pic:pic xmlns:pic="http://schemas.openxmlformats.org/drawingml/2006/picture">
+                  <pic:nvPicPr>
+                    <pic:cNvPr id="0" name="Picture 3"/>
+                    <pic:cNvPicPr>
+                      <a:picLocks noChangeAspect="1" noChangeArrowheads="1"/>
+                    </pic:cNvPicPr>
+                  </pic:nvPicPr>
+                  <pic:blipFill>
+                    <a:blip r:embed="rId18" cstate="print">
+                      <a:extLst>
+                        <a:ext uri="{28A0092B-C50C-407E-A947-70E740481C1C}">
+                          <a14:useLocalDpi xmlns:a14="http://schemas.microsoft.com/office/drawing/2010/main" val="0"/>
+                        </a:ext>
+                      </a:extLst>
+                    </a:blip>
+                    <a:srcRect/>
+                    <a:stretch>
+                      <a:fillRect/>
+                    </a:stretch>
+                  </pic:blipFill>
+                  <pic:spPr bwMode="auto">
+                    <a:xfrm>
+                      <a:off x="0" y="0"/>
+                      <a:ext cx="2987716" cy="4309493"/>
+                    </a:xfrm>
+                    <a:prstGeom prst="rect">
+                      <a:avLst/>
+                    </a:prstGeom>
+                    <a:noFill/>
+                    <a:ln>
+                      <a:noFill/>
+                    </a:ln>
+                  </pic:spPr>
+                </pic:pic>
+              </a:graphicData>
+            </a:graphic>
+          </wp:inline>
+        </w:drawing>
+      </w:r>
+    </w:p>
+    <w:p>
+      <w:pPr>
+        <w:jc w:val="center"/>
+        <w:rPr>
+          <w:lang w:val="es-MX"/>
+        </w:rPr>
+      </w:pPr>
+    </w:p>
+    <w:p>
+      <w:pPr>
         <w:rPr>
           <w:b/>
           <w:bCs/>
@@ -3954,11 +3900,8 @@
           <w:szCs w:val="32"/>
           <w:lang w:val="es-MX"/>
         </w:rPr>
-        <w:t>-</w:t>
-      </w:r>
-    </w:p>
-    <w:p>
-      <w:pPr>
+      </w:pPr>
+      <w:r>
         <w:rPr>
           <w:b/>
           <w:bCs/>
@@ -3966,7 +3909,8 @@
           <w:szCs w:val="32"/>
           <w:lang w:val="es-MX"/>
         </w:rPr>
-      </w:pPr>
+        <w:t>Conclusión genera</w:t>
+      </w:r>
       <w:r>
         <w:rPr>
           <w:b/>
@@ -3975,9 +3919,65 @@
           <w:szCs w:val="32"/>
           <w:lang w:val="es-MX"/>
         </w:rPr>
-        <w:t>Conclusión genera</w:t>
-      </w:r>
-      <w:r>
+        <w:t>l</w:t>
+      </w:r>
+    </w:p>
+    <w:p>
+      <w:pPr>
+        <w:jc w:val="both"/>
+        <w:rPr>
+          <w:sz w:val="24"/>
+          <w:szCs w:val="24"/>
+          <w:lang w:val="es-MX"/>
+        </w:rPr>
+      </w:pPr>
+      <w:r>
+        <w:rPr>
+          <w:sz w:val="24"/>
+          <w:szCs w:val="24"/>
+          <w:lang w:val="es-MX"/>
+        </w:rPr>
+        <w:t>El desarrollo de este proyecto permitió consolidar tanto la comprensión matemática como la aplicación práctica del Método de Bisección en la búsqueda de raíces de ecuaciones polinomiales. A través de la implementación algorítmica basada en el Teorema del Valor Intermedio (o Teorema de Bolzano), se comprobó la alta fiabilidad y la convergencia garantizada del método cuando se asegura un cambio de signo en los extremos del intervalo inicial. Si bien su convergencia es de carácter lineal y requiere un número mayor de iteraciones en comparación con métodos de mayor orden, su estabilidad lo convierte en una técnica fundamental e indispensable dentro del análisis numérico.</w:t>
+      </w:r>
+    </w:p>
+    <w:p>
+      <w:pPr>
+        <w:jc w:val="both"/>
+        <w:rPr>
+          <w:sz w:val="24"/>
+          <w:szCs w:val="24"/>
+          <w:lang w:val="es-MX"/>
+        </w:rPr>
+      </w:pPr>
+      <w:r>
+        <w:rPr>
+          <w:sz w:val="24"/>
+          <w:szCs w:val="24"/>
+          <w:lang w:val="es-MX"/>
+        </w:rPr>
+        <w:t>L</w:t>
+      </w:r>
+      <w:r>
+        <w:rPr>
+          <w:sz w:val="24"/>
+          <w:szCs w:val="24"/>
+          <w:lang w:val="es-MX"/>
+        </w:rPr>
+        <w:t>a automatización del algoritmo no solo elimina el margen de error humano y optimiza el cálculo iterativo de polinomios, sino que también reafirma el valor de integrar conceptos matemáticos rigurosos con buenas prácticas de programación para la resolución eficiente de problemas científicos e ingenieriles</w:t>
+      </w:r>
+    </w:p>
+    <w:p>
+      <w:pPr>
+        <w:jc w:val="both"/>
+        <w:rPr>
+          <w:sz w:val="24"/>
+          <w:szCs w:val="24"/>
+          <w:lang w:val="es-MX"/>
+        </w:rPr>
+      </w:pPr>
+    </w:p>
+    <w:p>
+      <w:pPr>
         <w:rPr>
           <w:b/>
           <w:bCs/>
@@ -3985,14 +3985,6 @@
           <w:szCs w:val="32"/>
           <w:lang w:val="es-MX"/>
         </w:rPr>
-        <w:t>l</w:t>
-      </w:r>
-    </w:p>
-    <w:p>
-      <w:pPr>
-        <w:rPr>
-          <w:lang w:val="es-MX"/>
-        </w:rPr>
       </w:pPr>
       <w:r>
         <w:rPr>
@@ -4002,27 +3994,7 @@
           <w:szCs w:val="32"/>
           <w:lang w:val="es-MX"/>
         </w:rPr>
-        <w:t>-</w:t>
-      </w:r>
-    </w:p>
-    <w:p>
-      <w:pPr>
-        <w:rPr>
-          <w:b/>
-          <w:bCs/>
-          <w:sz w:val="32"/>
-          <w:szCs w:val="32"/>
-          <w:lang w:val="es-MX"/>
-        </w:rPr>
-      </w:pPr>
-      <w:r>
-        <w:rPr>
-          <w:b/>
-          <w:bCs/>
-          <w:sz w:val="32"/>
-          <w:szCs w:val="32"/>
-          <w:lang w:val="es-MX"/>
-        </w:rPr>
+        <w:lastRenderedPageBreak/>
         <w:t>Ejemplo de ejecución</w:t>
       </w:r>
     </w:p>
@@ -4111,6 +4083,234 @@
 <file path=word/numbering.xml><?xml version="1.0" encoding="utf-8"?>
 <w:numbering xmlns:wpc="http://schemas.microsoft.com/office/word/2010/wordprocessingCanvas" xmlns:cx="http://schemas.microsoft.com/office/drawing/2014/chartex" xmlns:cx1="http://schemas.microsoft.com/office/drawing/2015/9/8/chartex" xmlns:cx2="http://schemas.microsoft.com/office/drawing/2015/10/21/chartex" xmlns:cx3="http://schemas.microsoft.com/office/drawing/2016/5/9/chartex" xmlns:cx4="http://schemas.microsoft.com/office/drawing/2016/5/10/chartex" xmlns:cx5="http://schemas.microsoft.com/office/drawing/2016/5/11/chartex" xmlns:cx6="http://schemas.microsoft.com/office/drawing/2016/5/12/chartex" xmlns:cx7="http://schemas.microsoft.com/office/drawing/2016/5/13/chartex" xmlns:cx8="http://schemas.microsoft.com/office/drawing/2016/5/14/chartex" xmlns:mc="http://schemas.openxmlformats.org/markup-compatibility/2006" xmlns:aink="http://schemas.microsoft.com/office/drawing/2016/ink" xmlns:am3d="http://schemas.microsoft.com/office/drawing/2017/model3d" xmlns:o="urn:schemas-microsoft-com:office:office" xmlns:oel="http://schemas.microsoft.com/office/2019/extlst" xmlns:r="http://schemas.openxmlformats.org/officeDocument/2006/relationships" xmlns:m="http://schemas.openxmlformats.org/officeDocument/2006/math" xmlns:v="urn:schemas-microsoft-com:vml" xmlns:wp14="http://schemas.microsoft.com/office/word/2010/wordprocessingDrawing" xmlns:wp="http://schemas.openxmlformats.org/drawingml/2006/wordprocessingDrawing" xmlns:w10="urn:schemas-microsoft-com:office:word" xmlns:w="http://schemas.openxmlformats.org/wordprocessingml/2006/main" xmlns:w14="http://schemas.microsoft.com/office/word/2010/wordml" xmlns:w15="http://schemas.microsoft.com/office/word/2012/wordml" xmlns:w16cex="http://schemas.microsoft.com/office/word/2018/wordml/cex" xmlns:w16cid="http://schemas.microsoft.com/office/word/2016/wordml/cid" xmlns:w16="http://schemas.microsoft.com/office/word/2018/wordml" xmlns:w16du="http://schemas.microsoft.com/office/word/2023/wordml/word16du" xmlns:w16sdtdh="http://schemas.microsoft.com/office/word/2020/wordml/sdtdatahash" xmlns:w16sdtfl="http://schemas.microsoft.com/office/word/2024/wordml/sdtformatlock" xmlns:w16se="http://schemas.microsoft.com/office/word/2015/wordml/symex" xmlns:wpg="http://schemas.microsoft.com/office/word/2010/wordprocessingGroup" xmlns:wpi="http://schemas.microsoft.com/office/word/2010/wordprocessingInk" xmlns:wne="http://schemas.microsoft.com/office/word/2006/wordml" xmlns:wps="http://schemas.microsoft.com/office/word/2010/wordprocessingShape" mc:Ignorable="w14 w15 w16se w16cid w16 w16cex w16sdtdh w16sdtfl w16du wp14">
   <w:abstractNum w:abstractNumId="0" w15:restartNumberingAfterBreak="0">
+    <w:nsid w:val="03586B81"/>
+    <w:multiLevelType w:val="hybridMultilevel"/>
+    <w:tmpl w:val="2F0C4904"/>
+    <w:lvl w:ilvl="0" w:tplc="BB8EEE36">
+      <w:numFmt w:val="bullet"/>
+      <w:lvlText w:val="-"/>
+      <w:lvlJc w:val="left"/>
+      <w:pPr>
+        <w:ind w:left="720" w:hanging="360"/>
+      </w:pPr>
+      <w:rPr>
+        <w:rFonts w:ascii="Calibri" w:eastAsiaTheme="minorHAnsi" w:hAnsi="Calibri" w:cs="Calibri" w:hint="default"/>
+        <w:b/>
+        <w:sz w:val="32"/>
+      </w:rPr>
+    </w:lvl>
+    <w:lvl w:ilvl="1" w:tplc="080A0003" w:tentative="1">
+      <w:start w:val="1"/>
+      <w:numFmt w:val="bullet"/>
+      <w:lvlText w:val="o"/>
+      <w:lvlJc w:val="left"/>
+      <w:pPr>
+        <w:ind w:left="1440" w:hanging="360"/>
+      </w:pPr>
+      <w:rPr>
+        <w:rFonts w:ascii="Courier New" w:hAnsi="Courier New" w:cs="Courier New" w:hint="default"/>
+      </w:rPr>
+    </w:lvl>
+    <w:lvl w:ilvl="2" w:tplc="080A0005" w:tentative="1">
+      <w:start w:val="1"/>
+      <w:numFmt w:val="bullet"/>
+      <w:lvlText w:val=""/>
+      <w:lvlJc w:val="left"/>
+      <w:pPr>
+        <w:ind w:left="2160" w:hanging="360"/>
+      </w:pPr>
+      <w:rPr>
+        <w:rFonts w:ascii="Wingdings" w:hAnsi="Wingdings" w:hint="default"/>
+      </w:rPr>
+    </w:lvl>
+    <w:lvl w:ilvl="3" w:tplc="080A0001" w:tentative="1">
+      <w:start w:val="1"/>
+      <w:numFmt w:val="bullet"/>
+      <w:lvlText w:val=""/>
+      <w:lvlJc w:val="left"/>
+      <w:pPr>
+        <w:ind w:left="2880" w:hanging="360"/>
+      </w:pPr>
+      <w:rPr>
+        <w:rFonts w:ascii="Symbol" w:hAnsi="Symbol" w:hint="default"/>
+      </w:rPr>
+    </w:lvl>
+    <w:lvl w:ilvl="4" w:tplc="080A0003" w:tentative="1">
+      <w:start w:val="1"/>
+      <w:numFmt w:val="bullet"/>
+      <w:lvlText w:val="o"/>
+      <w:lvlJc w:val="left"/>
+      <w:pPr>
+        <w:ind w:left="3600" w:hanging="360"/>
+      </w:pPr>
+      <w:rPr>
+        <w:rFonts w:ascii="Courier New" w:hAnsi="Courier New" w:cs="Courier New" w:hint="default"/>
+      </w:rPr>
+    </w:lvl>
+    <w:lvl w:ilvl="5" w:tplc="080A0005" w:tentative="1">
+      <w:start w:val="1"/>
+      <w:numFmt w:val="bullet"/>
+      <w:lvlText w:val=""/>
+      <w:lvlJc w:val="left"/>
+      <w:pPr>
+        <w:ind w:left="4320" w:hanging="360"/>
+      </w:pPr>
+      <w:rPr>
+        <w:rFonts w:ascii="Wingdings" w:hAnsi="Wingdings" w:hint="default"/>
+      </w:rPr>
+    </w:lvl>
+    <w:lvl w:ilvl="6" w:tplc="080A0001" w:tentative="1">
+      <w:start w:val="1"/>
+      <w:numFmt w:val="bullet"/>
+      <w:lvlText w:val=""/>
+      <w:lvlJc w:val="left"/>
+      <w:pPr>
+        <w:ind w:left="5040" w:hanging="360"/>
+      </w:pPr>
+      <w:rPr>
+        <w:rFonts w:ascii="Symbol" w:hAnsi="Symbol" w:hint="default"/>
+      </w:rPr>
+    </w:lvl>
+    <w:lvl w:ilvl="7" w:tplc="080A0003" w:tentative="1">
+      <w:start w:val="1"/>
+      <w:numFmt w:val="bullet"/>
+      <w:lvlText w:val="o"/>
+      <w:lvlJc w:val="left"/>
+      <w:pPr>
+        <w:ind w:left="5760" w:hanging="360"/>
+      </w:pPr>
+      <w:rPr>
+        <w:rFonts w:ascii="Courier New" w:hAnsi="Courier New" w:cs="Courier New" w:hint="default"/>
+      </w:rPr>
+    </w:lvl>
+    <w:lvl w:ilvl="8" w:tplc="080A0005" w:tentative="1">
+      <w:start w:val="1"/>
+      <w:numFmt w:val="bullet"/>
+      <w:lvlText w:val=""/>
+      <w:lvlJc w:val="left"/>
+      <w:pPr>
+        <w:ind w:left="6480" w:hanging="360"/>
+      </w:pPr>
+      <w:rPr>
+        <w:rFonts w:ascii="Wingdings" w:hAnsi="Wingdings" w:hint="default"/>
+      </w:rPr>
+    </w:lvl>
+  </w:abstractNum>
+  <w:abstractNum w:abstractNumId="1" w15:restartNumberingAfterBreak="0">
+    <w:nsid w:val="0DDD1AAC"/>
+    <w:multiLevelType w:val="hybridMultilevel"/>
+    <w:tmpl w:val="C5C6EB28"/>
+    <w:lvl w:ilvl="0" w:tplc="3FF4E6D2">
+      <w:numFmt w:val="bullet"/>
+      <w:lvlText w:val="-"/>
+      <w:lvlJc w:val="left"/>
+      <w:pPr>
+        <w:ind w:left="720" w:hanging="360"/>
+      </w:pPr>
+      <w:rPr>
+        <w:rFonts w:ascii="Calibri" w:eastAsiaTheme="minorHAnsi" w:hAnsi="Calibri" w:cs="Calibri" w:hint="default"/>
+        <w:b/>
+        <w:sz w:val="32"/>
+      </w:rPr>
+    </w:lvl>
+    <w:lvl w:ilvl="1" w:tplc="080A0003" w:tentative="1">
+      <w:start w:val="1"/>
+      <w:numFmt w:val="bullet"/>
+      <w:lvlText w:val="o"/>
+      <w:lvlJc w:val="left"/>
+      <w:pPr>
+        <w:ind w:left="1440" w:hanging="360"/>
+      </w:pPr>
+      <w:rPr>
+        <w:rFonts w:ascii="Courier New" w:hAnsi="Courier New" w:cs="Courier New" w:hint="default"/>
+      </w:rPr>
+    </w:lvl>
+    <w:lvl w:ilvl="2" w:tplc="080A0005" w:tentative="1">
+      <w:start w:val="1"/>
+      <w:numFmt w:val="bullet"/>
+      <w:lvlText w:val=""/>
+      <w:lvlJc w:val="left"/>
+      <w:pPr>
+        <w:ind w:left="2160" w:hanging="360"/>
+      </w:pPr>
+      <w:rPr>
+        <w:rFonts w:ascii="Wingdings" w:hAnsi="Wingdings" w:hint="default"/>
+      </w:rPr>
+    </w:lvl>
+    <w:lvl w:ilvl="3" w:tplc="080A0001" w:tentative="1">
+      <w:start w:val="1"/>
+      <w:numFmt w:val="bullet"/>
+      <w:lvlText w:val=""/>
+      <w:lvlJc w:val="left"/>
+      <w:pPr>
+        <w:ind w:left="2880" w:hanging="360"/>
+      </w:pPr>
+      <w:rPr>
+        <w:rFonts w:ascii="Symbol" w:hAnsi="Symbol" w:hint="default"/>
+      </w:rPr>
+    </w:lvl>
+    <w:lvl w:ilvl="4" w:tplc="080A0003" w:tentative="1">
+      <w:start w:val="1"/>
+      <w:numFmt w:val="bullet"/>
+      <w:lvlText w:val="o"/>
+      <w:lvlJc w:val="left"/>
+      <w:pPr>
+        <w:ind w:left="3600" w:hanging="360"/>
+      </w:pPr>
+      <w:rPr>
+        <w:rFonts w:ascii="Courier New" w:hAnsi="Courier New" w:cs="Courier New" w:hint="default"/>
+      </w:rPr>
+    </w:lvl>
+    <w:lvl w:ilvl="5" w:tplc="080A0005" w:tentative="1">
+      <w:start w:val="1"/>
+      <w:numFmt w:val="bullet"/>
+      <w:lvlText w:val=""/>
+      <w:lvlJc w:val="left"/>
+      <w:pPr>
+        <w:ind w:left="4320" w:hanging="360"/>
+      </w:pPr>
+      <w:rPr>
+        <w:rFonts w:ascii="Wingdings" w:hAnsi="Wingdings" w:hint="default"/>
+      </w:rPr>
+    </w:lvl>
+    <w:lvl w:ilvl="6" w:tplc="080A0001" w:tentative="1">
+      <w:start w:val="1"/>
+      <w:numFmt w:val="bullet"/>
+      <w:lvlText w:val=""/>
+      <w:lvlJc w:val="left"/>
+      <w:pPr>
+        <w:ind w:left="5040" w:hanging="360"/>
+      </w:pPr>
+      <w:rPr>
+        <w:rFonts w:ascii="Symbol" w:hAnsi="Symbol" w:hint="default"/>
+      </w:rPr>
+    </w:lvl>
+    <w:lvl w:ilvl="7" w:tplc="080A0003" w:tentative="1">
+      <w:start w:val="1"/>
+      <w:numFmt w:val="bullet"/>
+      <w:lvlText w:val="o"/>
+      <w:lvlJc w:val="left"/>
+      <w:pPr>
+        <w:ind w:left="5760" w:hanging="360"/>
+      </w:pPr>
+      <w:rPr>
+        <w:rFonts w:ascii="Courier New" w:hAnsi="Courier New" w:cs="Courier New" w:hint="default"/>
+      </w:rPr>
+    </w:lvl>
+    <w:lvl w:ilvl="8" w:tplc="080A0005" w:tentative="1">
+      <w:start w:val="1"/>
+      <w:numFmt w:val="bullet"/>
+      <w:lvlText w:val=""/>
+      <w:lvlJc w:val="left"/>
+      <w:pPr>
+        <w:ind w:left="6480" w:hanging="360"/>
+      </w:pPr>
+      <w:rPr>
+        <w:rFonts w:ascii="Wingdings" w:hAnsi="Wingdings" w:hint="default"/>
+      </w:rPr>
+    </w:lvl>
+  </w:abstractNum>
+  <w:abstractNum w:abstractNumId="2" w15:restartNumberingAfterBreak="0">
     <w:nsid w:val="22BA0541"/>
     <w:multiLevelType w:val="multilevel"/>
     <w:tmpl w:val="7160F628"/>
@@ -4223,7 +4423,7 @@
       </w:pPr>
     </w:lvl>
   </w:abstractNum>
-  <w:abstractNum w:abstractNumId="1" w15:restartNumberingAfterBreak="0">
+  <w:abstractNum w:abstractNumId="3" w15:restartNumberingAfterBreak="0">
     <w:nsid w:val="45F74A74"/>
     <w:multiLevelType w:val="multilevel"/>
     <w:tmpl w:val="F63CF294"/>
@@ -4372,7 +4572,7 @@
       </w:rPr>
     </w:lvl>
   </w:abstractNum>
-  <w:abstractNum w:abstractNumId="2" w15:restartNumberingAfterBreak="0">
+  <w:abstractNum w:abstractNumId="4" w15:restartNumberingAfterBreak="0">
     <w:nsid w:val="6044639C"/>
     <w:multiLevelType w:val="multilevel"/>
     <w:tmpl w:val="62EA139C"/>
@@ -4486,13 +4686,19 @@
     </w:lvl>
   </w:abstractNum>
   <w:num w:numId="1" w16cid:durableId="1877502811">
-    <w:abstractNumId w:val="0"/>
+    <w:abstractNumId w:val="2"/>
   </w:num>
   <w:num w:numId="2" w16cid:durableId="1890267718">
+    <w:abstractNumId w:val="3"/>
+  </w:num>
+  <w:num w:numId="3" w16cid:durableId="1693384906">
+    <w:abstractNumId w:val="4"/>
+  </w:num>
+  <w:num w:numId="4" w16cid:durableId="782653756">
     <w:abstractNumId w:val="1"/>
   </w:num>
-  <w:num w:numId="3" w16cid:durableId="1693384906">
-    <w:abstractNumId w:val="2"/>
+  <w:num w:numId="5" w16cid:durableId="528448088">
+    <w:abstractNumId w:val="0"/>
   </w:num>
 </w:numbering>
 </file>
@@ -4901,6 +5107,28 @@
       <w:spacing w:after="160" w:line="259" w:lineRule="auto"/>
     </w:pPr>
   </w:style>
+  <w:style w:type="paragraph" w:styleId="Ttulo2">
+    <w:name w:val="heading 2"/>
+    <w:basedOn w:val="Normal"/>
+    <w:next w:val="Normal"/>
+    <w:link w:val="Ttulo2Car"/>
+    <w:uiPriority w:val="9"/>
+    <w:unhideWhenUsed/>
+    <w:qFormat/>
+    <w:rsid w:val="00160EBE"/>
+    <w:pPr>
+      <w:keepNext/>
+      <w:keepLines/>
+      <w:spacing w:before="40" w:after="0"/>
+      <w:outlineLvl w:val="1"/>
+    </w:pPr>
+    <w:rPr>
+      <w:rFonts w:asciiTheme="majorHAnsi" w:eastAsiaTheme="majorEastAsia" w:hAnsiTheme="majorHAnsi" w:cstheme="majorBidi"/>
+      <w:color w:val="2F5496" w:themeColor="accent1" w:themeShade="BF"/>
+      <w:sz w:val="26"/>
+      <w:szCs w:val="26"/>
+    </w:rPr>
+  </w:style>
   <w:style w:type="character" w:default="1" w:styleId="Fuentedeprrafopredeter">
     <w:name w:val="Default Paragraph Font"/>
     <w:uiPriority w:val="1"/>
@@ -5025,6 +5253,30 @@
   <w:style w:type="paragraph" w:customStyle="1" w:styleId="FrameContents">
     <w:name w:val="Frame Contents"/>
     <w:basedOn w:val="Normal"/>
+  </w:style>
+  <w:style w:type="paragraph" w:styleId="Prrafodelista">
+    <w:name w:val="List Paragraph"/>
+    <w:basedOn w:val="Normal"/>
+    <w:uiPriority w:val="34"/>
+    <w:qFormat/>
+    <w:rsid w:val="00160EBE"/>
+    <w:pPr>
+      <w:ind w:left="720"/>
+      <w:contextualSpacing/>
+    </w:pPr>
+  </w:style>
+  <w:style w:type="character" w:customStyle="1" w:styleId="Ttulo2Car">
+    <w:name w:val="Título 2 Car"/>
+    <w:basedOn w:val="Fuentedeprrafopredeter"/>
+    <w:link w:val="Ttulo2"/>
+    <w:uiPriority w:val="9"/>
+    <w:rsid w:val="00160EBE"/>
+    <w:rPr>
+      <w:rFonts w:asciiTheme="majorHAnsi" w:eastAsiaTheme="majorEastAsia" w:hAnsiTheme="majorHAnsi" w:cstheme="majorBidi"/>
+      <w:color w:val="2F5496" w:themeColor="accent1" w:themeShade="BF"/>
+      <w:sz w:val="26"/>
+      <w:szCs w:val="26"/>
+    </w:rPr>
   </w:style>
 </w:styles>
 </file>
@@ -5201,4 +5453,16 @@
   <a:objectDefaults/>
   <a:extraClrSchemeLst/>
 </a:theme>
+</file>
+
+<file path=customXml/item1.xml><?xml version="1.0" encoding="utf-8"?>
+<b:Sources xmlns:b="http://schemas.openxmlformats.org/officeDocument/2006/bibliography" xmlns="http://schemas.openxmlformats.org/officeDocument/2006/bibliography" SelectedStyle="\APASixthEditionOfficeOnline.xsl" StyleName="APA" Version="6"/>
+</file>
+
+<file path=customXml/itemProps1.xml><?xml version="1.0" encoding="utf-8"?>
+<ds:datastoreItem xmlns:ds="http://schemas.openxmlformats.org/officeDocument/2006/customXml" ds:itemID="{0673F389-8C3E-4A94-A0CD-0BA9E3E8E0D5}">
+  <ds:schemaRefs>
+    <ds:schemaRef ds:uri="http://schemas.openxmlformats.org/officeDocument/2006/bibliography"/>
+  </ds:schemaRefs>
+</ds:datastoreItem>
 </file>
</xml_diff>

<commit_message>
Añadida la corrida de prueba y capturas de los diagramas de flujo
</commit_message>
<xml_diff>
--- a/documento.docx
+++ b/documento.docx
@@ -869,9 +869,9 @@
           <w:szCs w:val="28"/>
           <w:lang w:val="es-MX"/>
         </w:rPr>
-        <w:t>evaluar_polimonio</w:t>
-      </w:r>
-      <w:proofErr w:type="spellEnd"/>
+        <w:t>evaluar_</w:t>
+      </w:r>
+      <w:proofErr w:type="gramStart"/>
       <w:r>
         <w:rPr>
           <w:rFonts w:cstheme="minorHAnsi"/>
@@ -883,7 +883,35 @@
           <w:szCs w:val="28"/>
           <w:lang w:val="es-MX"/>
         </w:rPr>
-        <w:t>(coeficientes, x)</w:t>
+        <w:t>polimonio</w:t>
+      </w:r>
+      <w:proofErr w:type="spellEnd"/>
+      <w:r>
+        <w:rPr>
+          <w:rFonts w:cstheme="minorHAnsi"/>
+          <w:b/>
+          <w:bCs/>
+          <w:i/>
+          <w:iCs/>
+          <w:sz w:val="28"/>
+          <w:szCs w:val="28"/>
+          <w:lang w:val="es-MX"/>
+        </w:rPr>
+        <w:t>(</w:t>
+      </w:r>
+      <w:proofErr w:type="gramEnd"/>
+      <w:r>
+        <w:rPr>
+          <w:rFonts w:cstheme="minorHAnsi"/>
+          <w:b/>
+          <w:bCs/>
+          <w:i/>
+          <w:iCs/>
+          <w:sz w:val="28"/>
+          <w:szCs w:val="28"/>
+          <w:lang w:val="es-MX"/>
+        </w:rPr>
+        <w:t>coeficientes, x)</w:t>
       </w:r>
     </w:p>
     <w:p>
@@ -1107,6 +1135,7 @@
         </w:rPr>
       </w:pPr>
       <w:proofErr w:type="spellStart"/>
+      <w:proofErr w:type="gramStart"/>
       <w:r>
         <w:rPr>
           <w:rFonts w:cstheme="minorHAnsi"/>
@@ -1129,7 +1158,19 @@
           <w:szCs w:val="28"/>
           <w:lang w:val="es-MX"/>
         </w:rPr>
-        <w:t xml:space="preserve">(coeficientes, </w:t>
+        <w:t>(</w:t>
+      </w:r>
+      <w:proofErr w:type="gramEnd"/>
+      <w:r>
+        <w:rPr>
+          <w:rFonts w:cstheme="minorHAnsi"/>
+          <w:b/>
+          <w:bCs/>
+          <w:sz w:val="28"/>
+          <w:szCs w:val="28"/>
+          <w:lang w:val="es-MX"/>
+        </w:rPr>
+        <w:t xml:space="preserve">coeficientes, </w:t>
       </w:r>
       <w:proofErr w:type="spellStart"/>
       <w:r>
@@ -2203,9 +2244,9 @@
           <w:lang w:val="es-MX"/>
         </w:rPr>
         <w:lastRenderedPageBreak/>
-        <w:t>ejecutar_biseccion</w:t>
-      </w:r>
-      <w:proofErr w:type="spellEnd"/>
+        <w:t>ejecutar_</w:t>
+      </w:r>
+      <w:proofErr w:type="gramStart"/>
       <w:r>
         <w:rPr>
           <w:rFonts w:cstheme="minorHAnsi"/>
@@ -2215,7 +2256,31 @@
           <w:szCs w:val="28"/>
           <w:lang w:val="es-MX"/>
         </w:rPr>
-        <w:t>()</w:t>
+        <w:t>biseccion</w:t>
+      </w:r>
+      <w:proofErr w:type="spellEnd"/>
+      <w:r>
+        <w:rPr>
+          <w:rFonts w:cstheme="minorHAnsi"/>
+          <w:b/>
+          <w:bCs/>
+          <w:sz w:val="28"/>
+          <w:szCs w:val="28"/>
+          <w:lang w:val="es-MX"/>
+        </w:rPr>
+        <w:t>(</w:t>
+      </w:r>
+      <w:proofErr w:type="gramEnd"/>
+      <w:r>
+        <w:rPr>
+          <w:rFonts w:cstheme="minorHAnsi"/>
+          <w:b/>
+          <w:bCs/>
+          <w:sz w:val="28"/>
+          <w:szCs w:val="28"/>
+          <w:lang w:val="es-MX"/>
+        </w:rPr>
+        <w:t>)</w:t>
       </w:r>
     </w:p>
     <w:p>
@@ -2516,7 +2581,19 @@
           <w:szCs w:val="24"/>
           <w:lang w:val="es-MX"/>
         </w:rPr>
-        <w:t>leer_opcion</w:t>
+        <w:t>leer_</w:t>
+      </w:r>
+      <w:proofErr w:type="gramStart"/>
+      <w:r>
+        <w:rPr>
+          <w:rFonts w:cstheme="minorHAnsi"/>
+          <w:i/>
+          <w:iCs/>
+          <w:sz w:val="24"/>
+          <w:szCs w:val="24"/>
+          <w:lang w:val="es-MX"/>
+        </w:rPr>
+        <w:t>opcion</w:t>
       </w:r>
       <w:proofErr w:type="spellEnd"/>
       <w:r>
@@ -2531,6 +2608,7 @@
         <w:t>(</w:t>
       </w:r>
       <w:proofErr w:type="spellStart"/>
+      <w:proofErr w:type="gramEnd"/>
       <w:r>
         <w:rPr>
           <w:rFonts w:cstheme="minorHAnsi"/>
@@ -2964,7 +3042,19 @@
           <w:szCs w:val="24"/>
           <w:lang w:val="es-MX"/>
         </w:rPr>
-        <w:t>borrar_consola</w:t>
+        <w:t>borrar_</w:t>
+      </w:r>
+      <w:proofErr w:type="gramStart"/>
+      <w:r>
+        <w:rPr>
+          <w:rFonts w:cstheme="minorHAnsi"/>
+          <w:i/>
+          <w:iCs/>
+          <w:sz w:val="24"/>
+          <w:szCs w:val="24"/>
+          <w:lang w:val="es-MX"/>
+        </w:rPr>
+        <w:t>consola</w:t>
       </w:r>
       <w:proofErr w:type="spellEnd"/>
       <w:r>
@@ -2976,7 +3066,19 @@
           <w:szCs w:val="24"/>
           <w:lang w:val="es-MX"/>
         </w:rPr>
-        <w:t xml:space="preserve">(): limpia la pantalla según el sistema operativo (Windows: </w:t>
+        <w:t>(</w:t>
+      </w:r>
+      <w:proofErr w:type="gramEnd"/>
+      <w:r>
+        <w:rPr>
+          <w:rFonts w:cstheme="minorHAnsi"/>
+          <w:i/>
+          <w:iCs/>
+          <w:sz w:val="24"/>
+          <w:szCs w:val="24"/>
+          <w:lang w:val="es-MX"/>
+        </w:rPr>
+        <w:t xml:space="preserve">): limpia la pantalla según el sistema operativo (Windows: </w:t>
       </w:r>
       <w:proofErr w:type="spellStart"/>
       <w:r>
@@ -3027,16 +3129,41 @@
         <w:t>), pero solo si la entrada es una terminal interactiva (</w:t>
       </w:r>
       <w:proofErr w:type="spellStart"/>
-      <w:r>
-        <w:rPr>
-          <w:rFonts w:cstheme="minorHAnsi"/>
-          <w:i/>
-          <w:iCs/>
-          <w:sz w:val="24"/>
-          <w:szCs w:val="24"/>
-          <w:lang w:val="es-MX"/>
-        </w:rPr>
-        <w:t>sys.stdin.isatty</w:t>
+      <w:proofErr w:type="gramStart"/>
+      <w:r>
+        <w:rPr>
+          <w:rFonts w:cstheme="minorHAnsi"/>
+          <w:i/>
+          <w:iCs/>
+          <w:sz w:val="24"/>
+          <w:szCs w:val="24"/>
+          <w:lang w:val="es-MX"/>
+        </w:rPr>
+        <w:t>sys.stdin</w:t>
+      </w:r>
+      <w:proofErr w:type="gramEnd"/>
+      <w:r>
+        <w:rPr>
+          <w:rFonts w:cstheme="minorHAnsi"/>
+          <w:i/>
+          <w:iCs/>
+          <w:sz w:val="24"/>
+          <w:szCs w:val="24"/>
+          <w:lang w:val="es-MX"/>
+        </w:rPr>
+        <w:t>.</w:t>
+      </w:r>
+      <w:proofErr w:type="gramStart"/>
+      <w:r>
+        <w:rPr>
+          <w:rFonts w:cstheme="minorHAnsi"/>
+          <w:i/>
+          <w:iCs/>
+          <w:sz w:val="24"/>
+          <w:szCs w:val="24"/>
+          <w:lang w:val="es-MX"/>
+        </w:rPr>
+        <w:t>isatty</w:t>
       </w:r>
       <w:proofErr w:type="spellEnd"/>
       <w:r>
@@ -3048,7 +3175,19 @@
           <w:szCs w:val="24"/>
           <w:lang w:val="es-MX"/>
         </w:rPr>
-        <w:t>()).</w:t>
+        <w:t>(</w:t>
+      </w:r>
+      <w:proofErr w:type="gramEnd"/>
+      <w:r>
+        <w:rPr>
+          <w:rFonts w:cstheme="minorHAnsi"/>
+          <w:i/>
+          <w:iCs/>
+          <w:sz w:val="24"/>
+          <w:szCs w:val="24"/>
+          <w:lang w:val="es-MX"/>
+        </w:rPr>
+        <w:t>)).</w:t>
       </w:r>
     </w:p>
     <w:p>
@@ -3127,16 +3266,29 @@
           <w:lang w:val="es-MX"/>
         </w:rPr>
       </w:pPr>
-      <w:r>
-        <w:rPr>
-          <w:rFonts w:cstheme="minorHAnsi"/>
-          <w:i/>
-          <w:iCs/>
-          <w:sz w:val="24"/>
-          <w:szCs w:val="24"/>
-          <w:lang w:val="es-MX"/>
-        </w:rPr>
-        <w:t>pausar(): simula el comando pause de Windows o espera un Enter en otros sistemas, también solo en terminal interactiva.</w:t>
+      <w:proofErr w:type="gramStart"/>
+      <w:r>
+        <w:rPr>
+          <w:rFonts w:cstheme="minorHAnsi"/>
+          <w:i/>
+          <w:iCs/>
+          <w:sz w:val="24"/>
+          <w:szCs w:val="24"/>
+          <w:lang w:val="es-MX"/>
+        </w:rPr>
+        <w:t>pausar(</w:t>
+      </w:r>
+      <w:proofErr w:type="gramEnd"/>
+      <w:r>
+        <w:rPr>
+          <w:rFonts w:cstheme="minorHAnsi"/>
+          <w:i/>
+          <w:iCs/>
+          <w:sz w:val="24"/>
+          <w:szCs w:val="24"/>
+          <w:lang w:val="es-MX"/>
+        </w:rPr>
+        <w:t>): simula el comando pause de Windows o espera un Enter en otros sistemas, también solo en terminal interactiva.</w:t>
       </w:r>
     </w:p>
     <w:p>
@@ -3295,7 +3447,27 @@
           <w:szCs w:val="24"/>
           <w:lang w:val="es-MX"/>
         </w:rPr>
-        <w:t xml:space="preserve">main.py (o el script de ejecución) llama a run() del módulo </w:t>
+        <w:t xml:space="preserve">main.py (o el script de ejecución) llama a </w:t>
+      </w:r>
+      <w:proofErr w:type="gramStart"/>
+      <w:r>
+        <w:rPr>
+          <w:rFonts w:cstheme="minorHAnsi"/>
+          <w:sz w:val="24"/>
+          <w:szCs w:val="24"/>
+          <w:lang w:val="es-MX"/>
+        </w:rPr>
+        <w:t>run(</w:t>
+      </w:r>
+      <w:proofErr w:type="gramEnd"/>
+      <w:r>
+        <w:rPr>
+          <w:rFonts w:cstheme="minorHAnsi"/>
+          <w:sz w:val="24"/>
+          <w:szCs w:val="24"/>
+          <w:lang w:val="es-MX"/>
+        </w:rPr>
+        <w:t xml:space="preserve">) del módulo </w:t>
       </w:r>
       <w:proofErr w:type="spellStart"/>
       <w:r>
@@ -3332,14 +3504,25 @@
           <w:lang w:val="es-MX"/>
         </w:rPr>
       </w:pPr>
-      <w:r>
-        <w:rPr>
-          <w:rFonts w:cstheme="minorHAnsi"/>
-          <w:sz w:val="24"/>
-          <w:szCs w:val="24"/>
-          <w:lang w:val="es-MX"/>
-        </w:rPr>
-        <w:t xml:space="preserve">run() muestra el menú y, si se elige la opción 1, llama a </w:t>
+      <w:proofErr w:type="gramStart"/>
+      <w:r>
+        <w:rPr>
+          <w:rFonts w:cstheme="minorHAnsi"/>
+          <w:sz w:val="24"/>
+          <w:szCs w:val="24"/>
+          <w:lang w:val="es-MX"/>
+        </w:rPr>
+        <w:t>run(</w:t>
+      </w:r>
+      <w:proofErr w:type="gramEnd"/>
+      <w:r>
+        <w:rPr>
+          <w:rFonts w:cstheme="minorHAnsi"/>
+          <w:sz w:val="24"/>
+          <w:szCs w:val="24"/>
+          <w:lang w:val="es-MX"/>
+        </w:rPr>
+        <w:t xml:space="preserve">) muestra el menú y, si se elige la opción 1, llama a </w:t>
       </w:r>
       <w:proofErr w:type="spellStart"/>
       <w:r>
@@ -3349,7 +3532,17 @@
           <w:szCs w:val="24"/>
           <w:lang w:val="es-MX"/>
         </w:rPr>
-        <w:t>ejecutar_biseccion</w:t>
+        <w:t>ejecutar_</w:t>
+      </w:r>
+      <w:proofErr w:type="gramStart"/>
+      <w:r>
+        <w:rPr>
+          <w:rFonts w:cstheme="minorHAnsi"/>
+          <w:sz w:val="24"/>
+          <w:szCs w:val="24"/>
+          <w:lang w:val="es-MX"/>
+        </w:rPr>
+        <w:t>biseccion</w:t>
       </w:r>
       <w:proofErr w:type="spellEnd"/>
       <w:r>
@@ -3359,7 +3552,17 @@
           <w:szCs w:val="24"/>
           <w:lang w:val="es-MX"/>
         </w:rPr>
-        <w:t xml:space="preserve">() del módulo </w:t>
+        <w:t>(</w:t>
+      </w:r>
+      <w:proofErr w:type="gramEnd"/>
+      <w:r>
+        <w:rPr>
+          <w:rFonts w:cstheme="minorHAnsi"/>
+          <w:sz w:val="24"/>
+          <w:szCs w:val="24"/>
+          <w:lang w:val="es-MX"/>
+        </w:rPr>
+        <w:t xml:space="preserve">) del módulo </w:t>
       </w:r>
       <w:proofErr w:type="spellStart"/>
       <w:r>
@@ -3404,7 +3607,17 @@
           <w:szCs w:val="24"/>
           <w:lang w:val="es-MX"/>
         </w:rPr>
-        <w:t>ejecutar_biseccion</w:t>
+        <w:t>ejecutar_</w:t>
+      </w:r>
+      <w:proofErr w:type="gramStart"/>
+      <w:r>
+        <w:rPr>
+          <w:rFonts w:cstheme="minorHAnsi"/>
+          <w:sz w:val="24"/>
+          <w:szCs w:val="24"/>
+          <w:lang w:val="es-MX"/>
+        </w:rPr>
+        <w:t>biseccion</w:t>
       </w:r>
       <w:proofErr w:type="spellEnd"/>
       <w:r>
@@ -3414,7 +3627,17 @@
           <w:szCs w:val="24"/>
           <w:lang w:val="es-MX"/>
         </w:rPr>
-        <w:t xml:space="preserve">() solicita los datos al usuario usando </w:t>
+        <w:t>(</w:t>
+      </w:r>
+      <w:proofErr w:type="gramEnd"/>
+      <w:r>
+        <w:rPr>
+          <w:rFonts w:cstheme="minorHAnsi"/>
+          <w:sz w:val="24"/>
+          <w:szCs w:val="24"/>
+          <w:lang w:val="es-MX"/>
+        </w:rPr>
+        <w:t xml:space="preserve">) solicita los datos al usuario usando </w:t>
       </w:r>
       <w:proofErr w:type="spellStart"/>
       <w:r>
@@ -3457,6 +3680,7 @@
         <w:t xml:space="preserve">, valida los coeficientes y el intervalo, y llama a </w:t>
       </w:r>
       <w:proofErr w:type="spellStart"/>
+      <w:proofErr w:type="gramStart"/>
       <w:r>
         <w:rPr>
           <w:rFonts w:cstheme="minorHAnsi"/>
@@ -3474,7 +3698,17 @@
           <w:szCs w:val="24"/>
           <w:lang w:val="es-MX"/>
         </w:rPr>
-        <w:t>().</w:t>
+        <w:t>(</w:t>
+      </w:r>
+      <w:proofErr w:type="gramEnd"/>
+      <w:r>
+        <w:rPr>
+          <w:rFonts w:cstheme="minorHAnsi"/>
+          <w:sz w:val="24"/>
+          <w:szCs w:val="24"/>
+          <w:lang w:val="es-MX"/>
+        </w:rPr>
+        <w:t>).</w:t>
       </w:r>
     </w:p>
     <w:p>
@@ -3492,6 +3726,7 @@
         </w:rPr>
       </w:pPr>
       <w:proofErr w:type="spellStart"/>
+      <w:proofErr w:type="gramStart"/>
       <w:r>
         <w:rPr>
           <w:rFonts w:cstheme="minorHAnsi"/>
@@ -3510,7 +3745,17 @@
           <w:szCs w:val="24"/>
           <w:lang w:val="es-MX"/>
         </w:rPr>
-        <w:t xml:space="preserve">() utiliza </w:t>
+        <w:t>(</w:t>
+      </w:r>
+      <w:proofErr w:type="gramEnd"/>
+      <w:r>
+        <w:rPr>
+          <w:rFonts w:cstheme="minorHAnsi"/>
+          <w:sz w:val="24"/>
+          <w:szCs w:val="24"/>
+          <w:lang w:val="es-MX"/>
+        </w:rPr>
+        <w:t xml:space="preserve">) utiliza </w:t>
       </w:r>
       <w:proofErr w:type="spellStart"/>
       <w:r>
@@ -3520,7 +3765,17 @@
           <w:szCs w:val="24"/>
           <w:lang w:val="es-MX"/>
         </w:rPr>
-        <w:t>evaluar_polimonio</w:t>
+        <w:t>evaluar_</w:t>
+      </w:r>
+      <w:proofErr w:type="gramStart"/>
+      <w:r>
+        <w:rPr>
+          <w:rFonts w:cstheme="minorHAnsi"/>
+          <w:sz w:val="24"/>
+          <w:szCs w:val="24"/>
+          <w:lang w:val="es-MX"/>
+        </w:rPr>
+        <w:t>polimonio</w:t>
       </w:r>
       <w:proofErr w:type="spellEnd"/>
       <w:r>
@@ -3530,7 +3785,17 @@
           <w:szCs w:val="24"/>
           <w:lang w:val="es-MX"/>
         </w:rPr>
-        <w:t>() para calcular los valores de f y ejecuta el algoritmo, devolviendo la raíz, el número de iteraciones y el historial.</w:t>
+        <w:t>(</w:t>
+      </w:r>
+      <w:proofErr w:type="gramEnd"/>
+      <w:r>
+        <w:rPr>
+          <w:rFonts w:cstheme="minorHAnsi"/>
+          <w:sz w:val="24"/>
+          <w:szCs w:val="24"/>
+          <w:lang w:val="es-MX"/>
+        </w:rPr>
+        <w:t>) para calcular los valores de f y ejecuta el algoritmo, devolviendo la raíz, el número de iteraciones y el historial.</w:t>
       </w:r>
     </w:p>
     <w:p>
@@ -3555,7 +3820,17 @@
           <w:szCs w:val="24"/>
           <w:lang w:val="es-MX"/>
         </w:rPr>
-        <w:t>ejecutar_biseccion</w:t>
+        <w:t>ejecutar_</w:t>
+      </w:r>
+      <w:proofErr w:type="gramStart"/>
+      <w:r>
+        <w:rPr>
+          <w:rFonts w:cstheme="minorHAnsi"/>
+          <w:sz w:val="24"/>
+          <w:szCs w:val="24"/>
+          <w:lang w:val="es-MX"/>
+        </w:rPr>
+        <w:t>biseccion</w:t>
       </w:r>
       <w:proofErr w:type="spellEnd"/>
       <w:r>
@@ -3565,7 +3840,17 @@
           <w:szCs w:val="24"/>
           <w:lang w:val="es-MX"/>
         </w:rPr>
-        <w:t>() muestra los resultados y la tabla de iteraciones.</w:t>
+        <w:t>(</w:t>
+      </w:r>
+      <w:proofErr w:type="gramEnd"/>
+      <w:r>
+        <w:rPr>
+          <w:rFonts w:cstheme="minorHAnsi"/>
+          <w:sz w:val="24"/>
+          <w:szCs w:val="24"/>
+          <w:lang w:val="es-MX"/>
+        </w:rPr>
+        <w:t>) muestra los resultados y la tabla de iteraciones.</w:t>
       </w:r>
     </w:p>
     <w:p>
@@ -3582,14 +3867,25 @@
           <w:lang w:val="es-MX"/>
         </w:rPr>
       </w:pPr>
-      <w:r>
-        <w:rPr>
-          <w:rFonts w:cstheme="minorHAnsi"/>
-          <w:sz w:val="24"/>
-          <w:szCs w:val="24"/>
-          <w:lang w:val="es-MX"/>
-        </w:rPr>
-        <w:t>run() pausa la pantalla y vuelve al menú hasta que el usuario elija salir.</w:t>
+      <w:proofErr w:type="gramStart"/>
+      <w:r>
+        <w:rPr>
+          <w:rFonts w:cstheme="minorHAnsi"/>
+          <w:sz w:val="24"/>
+          <w:szCs w:val="24"/>
+          <w:lang w:val="es-MX"/>
+        </w:rPr>
+        <w:t>run(</w:t>
+      </w:r>
+      <w:proofErr w:type="gramEnd"/>
+      <w:r>
+        <w:rPr>
+          <w:rFonts w:cstheme="minorHAnsi"/>
+          <w:sz w:val="24"/>
+          <w:szCs w:val="24"/>
+          <w:lang w:val="es-MX"/>
+        </w:rPr>
+        <w:t>) pausa la pantalla y vuelve al menú hasta que el usuario elija salir.</w:t>
       </w:r>
     </w:p>
     <w:p>
@@ -3680,9 +3976,9 @@
           <w:lang w:val="es-MX"/>
         </w:rPr>
         <w:drawing>
-          <wp:inline distT="0" distB="0" distL="0" distR="0" wp14:anchorId="69B1A1DA" wp14:editId="73DE5F52">
-            <wp:extent cx="2057400" cy="3353950"/>
-            <wp:effectExtent l="0" t="0" r="0" b="0"/>
+          <wp:inline distT="0" distB="0" distL="0" distR="0" wp14:anchorId="69B1A1DA" wp14:editId="7BCCE0AC">
+            <wp:extent cx="3114675" cy="5077508"/>
+            <wp:effectExtent l="0" t="0" r="0" b="8890"/>
             <wp:docPr id="388547408" name="Imagen 1"/>
             <wp:cNvGraphicFramePr>
               <a:graphicFrameLocks xmlns:a="http://schemas.openxmlformats.org/drawingml/2006/main" noChangeAspect="1"/>
@@ -3712,7 +4008,7 @@
                   <pic:spPr bwMode="auto">
                     <a:xfrm>
                       <a:off x="0" y="0"/>
-                      <a:ext cx="2063524" cy="3363934"/>
+                      <a:ext cx="3125177" cy="5094628"/>
                     </a:xfrm>
                     <a:prstGeom prst="rect">
                       <a:avLst/>
@@ -3756,11 +4052,154 @@
           <w:noProof/>
           <w:lang w:val="es-MX"/>
         </w:rPr>
+        <mc:AlternateContent>
+          <mc:Choice Requires="wps">
+            <w:drawing>
+              <wp:anchor distT="0" distB="0" distL="114300" distR="114300" simplePos="0" relativeHeight="251659264" behindDoc="0" locked="0" layoutInCell="1" allowOverlap="1" wp14:anchorId="4CCCD255" wp14:editId="0DC3A3A5">
+                <wp:simplePos x="0" y="0"/>
+                <wp:positionH relativeFrom="column">
+                  <wp:posOffset>2455397</wp:posOffset>
+                </wp:positionH>
+                <wp:positionV relativeFrom="paragraph">
+                  <wp:posOffset>7192985</wp:posOffset>
+                </wp:positionV>
+                <wp:extent cx="744279" cy="669851"/>
+                <wp:effectExtent l="0" t="0" r="17780" b="16510"/>
+                <wp:wrapNone/>
+                <wp:docPr id="1578679032" name="Elipse 7"/>
+                <wp:cNvGraphicFramePr/>
+                <a:graphic xmlns:a="http://schemas.openxmlformats.org/drawingml/2006/main">
+                  <a:graphicData uri="http://schemas.microsoft.com/office/word/2010/wordprocessingShape">
+                    <wps:wsp>
+                      <wps:cNvSpPr/>
+                      <wps:spPr>
+                        <a:xfrm>
+                          <a:off x="0" y="0"/>
+                          <a:ext cx="744279" cy="669851"/>
+                        </a:xfrm>
+                        <a:prstGeom prst="ellipse">
+                          <a:avLst/>
+                        </a:prstGeom>
+                        <a:solidFill>
+                          <a:srgbClr val="F0AEAE"/>
+                        </a:solidFill>
+                        <a:ln>
+                          <a:solidFill>
+                            <a:srgbClr val="EE0000"/>
+                          </a:solidFill>
+                        </a:ln>
+                      </wps:spPr>
+                      <wps:style>
+                        <a:lnRef idx="2">
+                          <a:schemeClr val="accent1">
+                            <a:shade val="15000"/>
+                          </a:schemeClr>
+                        </a:lnRef>
+                        <a:fillRef idx="1">
+                          <a:schemeClr val="accent1"/>
+                        </a:fillRef>
+                        <a:effectRef idx="0">
+                          <a:schemeClr val="accent1"/>
+                        </a:effectRef>
+                        <a:fontRef idx="minor">
+                          <a:schemeClr val="lt1"/>
+                        </a:fontRef>
+                      </wps:style>
+                      <wps:txbx>
+                        <w:txbxContent>
+                          <w:p>
+                            <w:pPr>
+                              <w:jc w:val="center"/>
+                              <w:rPr>
+                                <w:b/>
+                                <w:bCs/>
+                                <w:i/>
+                                <w:iCs/>
+                                <w:color w:val="000000" w:themeColor="text1"/>
+                                <w:sz w:val="28"/>
+                                <w:szCs w:val="28"/>
+                                <w:lang w:val="es-MX"/>
+                              </w:rPr>
+                            </w:pPr>
+                            <w:r>
+                              <w:rPr>
+                                <w:b/>
+                                <w:bCs/>
+                                <w:i/>
+                                <w:iCs/>
+                                <w:color w:val="000000" w:themeColor="text1"/>
+                                <w:sz w:val="28"/>
+                                <w:szCs w:val="28"/>
+                                <w:lang w:val="es-MX"/>
+                              </w:rPr>
+                              <w:t>1</w:t>
+                            </w:r>
+                          </w:p>
+                        </w:txbxContent>
+                      </wps:txbx>
+                      <wps:bodyPr rot="0" spcFirstLastPara="0" vertOverflow="overflow" horzOverflow="overflow" vert="horz" wrap="square" lIns="91440" tIns="45720" rIns="91440" bIns="45720" numCol="1" spcCol="0" rtlCol="0" fromWordArt="0" anchor="ctr" anchorCtr="0" forceAA="0" compatLnSpc="1">
+                        <a:prstTxWarp prst="textNoShape">
+                          <a:avLst/>
+                        </a:prstTxWarp>
+                        <a:noAutofit/>
+                      </wps:bodyPr>
+                    </wps:wsp>
+                  </a:graphicData>
+                </a:graphic>
+              </wp:anchor>
+            </w:drawing>
+          </mc:Choice>
+          <mc:Fallback>
+            <w:pict>
+              <v:oval w14:anchorId="4CCCD255" id="Elipse 7" o:spid="_x0000_s1026" style="position:absolute;left:0;text-align:left;margin-left:193.35pt;margin-top:566.4pt;width:58.6pt;height:52.75pt;z-index:251659264;visibility:visible;mso-wrap-style:square;mso-wrap-distance-left:9pt;mso-wrap-distance-top:0;mso-wrap-distance-right:9pt;mso-wrap-distance-bottom:0;mso-position-horizontal:absolute;mso-position-horizontal-relative:text;mso-position-vertical:absolute;mso-position-vertical-relative:text;v-text-anchor:middle" o:gfxdata="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" fillcolor="#f0aeae" strokecolor="#e00" strokeweight="1pt">
+                <v:stroke joinstyle="miter"/>
+                <v:textbox>
+                  <w:txbxContent>
+                    <w:p>
+                      <w:pPr>
+                        <w:jc w:val="center"/>
+                        <w:rPr>
+                          <w:b/>
+                          <w:bCs/>
+                          <w:i/>
+                          <w:iCs/>
+                          <w:color w:val="000000" w:themeColor="text1"/>
+                          <w:sz w:val="28"/>
+                          <w:szCs w:val="28"/>
+                          <w:lang w:val="es-MX"/>
+                        </w:rPr>
+                      </w:pPr>
+                      <w:r>
+                        <w:rPr>
+                          <w:b/>
+                          <w:bCs/>
+                          <w:i/>
+                          <w:iCs/>
+                          <w:color w:val="000000" w:themeColor="text1"/>
+                          <w:sz w:val="28"/>
+                          <w:szCs w:val="28"/>
+                          <w:lang w:val="es-MX"/>
+                        </w:rPr>
+                        <w:t>1</w:t>
+                      </w:r>
+                    </w:p>
+                  </w:txbxContent>
+                </v:textbox>
+              </v:oval>
+            </w:pict>
+          </mc:Fallback>
+        </mc:AlternateContent>
+      </w:r>
+      <w:r>
+        <w:rPr>
+          <w:noProof/>
+          <w:lang w:val="es-MX"/>
+        </w:rPr>
         <w:drawing>
-          <wp:inline distT="0" distB="0" distL="0" distR="0" wp14:anchorId="2DEDF0C9" wp14:editId="13AA87D0">
-            <wp:extent cx="7393837" cy="5777592"/>
-            <wp:effectExtent l="7938" t="0" r="6032" b="6033"/>
-            <wp:docPr id="1450425004" name="Imagen 2"/>
+          <wp:inline distT="0" distB="0" distL="0" distR="0" wp14:anchorId="2233C92C" wp14:editId="78AA0DB1">
+            <wp:extent cx="4231758" cy="7254441"/>
+            <wp:effectExtent l="0" t="0" r="0" b="3810"/>
+            <wp:docPr id="410067729" name="Imagen 4"/>
             <wp:cNvGraphicFramePr>
               <a:graphicFrameLocks xmlns:a="http://schemas.openxmlformats.org/drawingml/2006/main" noChangeAspect="1"/>
             </wp:cNvGraphicFramePr>
@@ -3768,13 +4207,669 @@
               <a:graphicData uri="http://schemas.openxmlformats.org/drawingml/2006/picture">
                 <pic:pic xmlns:pic="http://schemas.openxmlformats.org/drawingml/2006/picture">
                   <pic:nvPicPr>
-                    <pic:cNvPr id="0" name="Picture 2"/>
+                    <pic:cNvPr id="0" name="Picture 4"/>
                     <pic:cNvPicPr>
                       <a:picLocks noChangeAspect="1" noChangeArrowheads="1"/>
                     </pic:cNvPicPr>
                   </pic:nvPicPr>
                   <pic:blipFill>
-                    <a:blip r:embed="rId17" cstate="print">
+                    <a:blip r:embed="rId17">
+                      <a:extLst>
+                        <a:ext uri="{28A0092B-C50C-407E-A947-70E740481C1C}">
+                          <a14:useLocalDpi xmlns:a14="http://schemas.microsoft.com/office/drawing/2010/main" val="0"/>
+                        </a:ext>
+                      </a:extLst>
+                    </a:blip>
+                    <a:srcRect/>
+                    <a:stretch>
+                      <a:fillRect/>
+                    </a:stretch>
+                  </pic:blipFill>
+                  <pic:spPr bwMode="auto">
+                    <a:xfrm>
+                      <a:off x="0" y="0"/>
+                      <a:ext cx="4240248" cy="7268996"/>
+                    </a:xfrm>
+                    <a:prstGeom prst="rect">
+                      <a:avLst/>
+                    </a:prstGeom>
+                    <a:noFill/>
+                    <a:ln>
+                      <a:noFill/>
+                    </a:ln>
+                  </pic:spPr>
+                </pic:pic>
+              </a:graphicData>
+            </a:graphic>
+          </wp:inline>
+        </w:drawing>
+      </w:r>
+    </w:p>
+    <w:p>
+      <w:pPr>
+        <w:jc w:val="center"/>
+        <w:rPr>
+          <w:lang w:val="es-MX"/>
+        </w:rPr>
+      </w:pPr>
+      <w:r>
+        <w:rPr>
+          <w:noProof/>
+          <w:lang w:val="es-MX"/>
+        </w:rPr>
+        <w:lastRenderedPageBreak/>
+        <mc:AlternateContent>
+          <mc:Choice Requires="wps">
+            <w:drawing>
+              <wp:anchor distT="0" distB="0" distL="114300" distR="114300" simplePos="0" relativeHeight="251671552" behindDoc="0" locked="0" layoutInCell="1" allowOverlap="1" wp14:anchorId="220250E0" wp14:editId="7F2050F2">
+                <wp:simplePos x="0" y="0"/>
+                <wp:positionH relativeFrom="margin">
+                  <wp:posOffset>5507591</wp:posOffset>
+                </wp:positionH>
+                <wp:positionV relativeFrom="paragraph">
+                  <wp:posOffset>233769</wp:posOffset>
+                </wp:positionV>
+                <wp:extent cx="478406" cy="425302"/>
+                <wp:effectExtent l="0" t="0" r="17145" b="13335"/>
+                <wp:wrapNone/>
+                <wp:docPr id="714350799" name="Elipse 7"/>
+                <wp:cNvGraphicFramePr/>
+                <a:graphic xmlns:a="http://schemas.openxmlformats.org/drawingml/2006/main">
+                  <a:graphicData uri="http://schemas.microsoft.com/office/word/2010/wordprocessingShape">
+                    <wps:wsp>
+                      <wps:cNvSpPr/>
+                      <wps:spPr>
+                        <a:xfrm>
+                          <a:off x="0" y="0"/>
+                          <a:ext cx="478406" cy="425302"/>
+                        </a:xfrm>
+                        <a:prstGeom prst="ellipse">
+                          <a:avLst/>
+                        </a:prstGeom>
+                        <a:solidFill>
+                          <a:srgbClr val="F0AEAE"/>
+                        </a:solidFill>
+                        <a:ln>
+                          <a:solidFill>
+                            <a:srgbClr val="EE0000"/>
+                          </a:solidFill>
+                        </a:ln>
+                      </wps:spPr>
+                      <wps:style>
+                        <a:lnRef idx="2">
+                          <a:schemeClr val="accent1">
+                            <a:shade val="15000"/>
+                          </a:schemeClr>
+                        </a:lnRef>
+                        <a:fillRef idx="1">
+                          <a:schemeClr val="accent1"/>
+                        </a:fillRef>
+                        <a:effectRef idx="0">
+                          <a:schemeClr val="accent1"/>
+                        </a:effectRef>
+                        <a:fontRef idx="minor">
+                          <a:schemeClr val="lt1"/>
+                        </a:fontRef>
+                      </wps:style>
+                      <wps:txbx>
+                        <w:txbxContent>
+                          <w:p>
+                            <w:pPr>
+                              <w:jc w:val="center"/>
+                              <w:rPr>
+                                <w:b/>
+                                <w:bCs/>
+                                <w:i/>
+                                <w:iCs/>
+                                <w:color w:val="000000" w:themeColor="text1"/>
+                                <w:sz w:val="28"/>
+                                <w:szCs w:val="28"/>
+                                <w:lang w:val="es-MX"/>
+                              </w:rPr>
+                            </w:pPr>
+                            <w:r>
+                              <w:rPr>
+                                <w:b/>
+                                <w:bCs/>
+                                <w:i/>
+                                <w:iCs/>
+                                <w:color w:val="000000" w:themeColor="text1"/>
+                                <w:sz w:val="28"/>
+                                <w:szCs w:val="28"/>
+                                <w:lang w:val="es-MX"/>
+                              </w:rPr>
+                              <w:t>4</w:t>
+                            </w:r>
+                          </w:p>
+                        </w:txbxContent>
+                      </wps:txbx>
+                      <wps:bodyPr rot="0" spcFirstLastPara="0" vertOverflow="overflow" horzOverflow="overflow" vert="horz" wrap="square" lIns="91440" tIns="45720" rIns="91440" bIns="45720" numCol="1" spcCol="0" rtlCol="0" fromWordArt="0" anchor="ctr" anchorCtr="0" forceAA="0" compatLnSpc="1">
+                        <a:prstTxWarp prst="textNoShape">
+                          <a:avLst/>
+                        </a:prstTxWarp>
+                        <a:noAutofit/>
+                      </wps:bodyPr>
+                    </wps:wsp>
+                  </a:graphicData>
+                </a:graphic>
+                <wp14:sizeRelH relativeFrom="margin">
+                  <wp14:pctWidth>0</wp14:pctWidth>
+                </wp14:sizeRelH>
+                <wp14:sizeRelV relativeFrom="margin">
+                  <wp14:pctHeight>0</wp14:pctHeight>
+                </wp14:sizeRelV>
+              </wp:anchor>
+            </w:drawing>
+          </mc:Choice>
+          <mc:Fallback>
+            <w:pict>
+              <v:oval w14:anchorId="220250E0" id="_x0000_s1027" style="position:absolute;left:0;text-align:left;margin-left:433.65pt;margin-top:18.4pt;width:37.65pt;height:33.5pt;z-index:251671552;visibility:visible;mso-wrap-style:square;mso-width-percent:0;mso-height-percent:0;mso-wrap-distance-left:9pt;mso-wrap-distance-top:0;mso-wrap-distance-right:9pt;mso-wrap-distance-bottom:0;mso-position-horizontal:absolute;mso-position-horizontal-relative:margin;mso-position-vertical:absolute;mso-position-vertical-relative:text;mso-width-percent:0;mso-height-percent:0;mso-width-relative:margin;mso-height-relative:margin;v-text-anchor:middle" o:gfxdata="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" fillcolor="#f0aeae" strokecolor="#e00" strokeweight="1pt">
+                <v:stroke joinstyle="miter"/>
+                <v:textbox>
+                  <w:txbxContent>
+                    <w:p>
+                      <w:pPr>
+                        <w:jc w:val="center"/>
+                        <w:rPr>
+                          <w:b/>
+                          <w:bCs/>
+                          <w:i/>
+                          <w:iCs/>
+                          <w:color w:val="000000" w:themeColor="text1"/>
+                          <w:sz w:val="28"/>
+                          <w:szCs w:val="28"/>
+                          <w:lang w:val="es-MX"/>
+                        </w:rPr>
+                      </w:pPr>
+                      <w:r>
+                        <w:rPr>
+                          <w:b/>
+                          <w:bCs/>
+                          <w:i/>
+                          <w:iCs/>
+                          <w:color w:val="000000" w:themeColor="text1"/>
+                          <w:sz w:val="28"/>
+                          <w:szCs w:val="28"/>
+                          <w:lang w:val="es-MX"/>
+                        </w:rPr>
+                        <w:t>4</w:t>
+                      </w:r>
+                    </w:p>
+                  </w:txbxContent>
+                </v:textbox>
+                <w10:wrap anchorx="margin"/>
+              </v:oval>
+            </w:pict>
+          </mc:Fallback>
+        </mc:AlternateContent>
+      </w:r>
+      <w:r>
+        <w:rPr>
+          <w:noProof/>
+          <w:lang w:val="es-MX"/>
+        </w:rPr>
+        <mc:AlternateContent>
+          <mc:Choice Requires="wps">
+            <w:drawing>
+              <wp:anchor distT="0" distB="0" distL="114300" distR="114300" simplePos="0" relativeHeight="251667456" behindDoc="0" locked="0" layoutInCell="1" allowOverlap="1" wp14:anchorId="49EF491D" wp14:editId="3FA209B0">
+                <wp:simplePos x="0" y="0"/>
+                <wp:positionH relativeFrom="margin">
+                  <wp:posOffset>5507104</wp:posOffset>
+                </wp:positionH>
+                <wp:positionV relativeFrom="paragraph">
+                  <wp:posOffset>2732242</wp:posOffset>
+                </wp:positionV>
+                <wp:extent cx="478406" cy="425302"/>
+                <wp:effectExtent l="0" t="0" r="17145" b="13335"/>
+                <wp:wrapNone/>
+                <wp:docPr id="1330947761" name="Elipse 7"/>
+                <wp:cNvGraphicFramePr/>
+                <a:graphic xmlns:a="http://schemas.openxmlformats.org/drawingml/2006/main">
+                  <a:graphicData uri="http://schemas.microsoft.com/office/word/2010/wordprocessingShape">
+                    <wps:wsp>
+                      <wps:cNvSpPr/>
+                      <wps:spPr>
+                        <a:xfrm>
+                          <a:off x="0" y="0"/>
+                          <a:ext cx="478406" cy="425302"/>
+                        </a:xfrm>
+                        <a:prstGeom prst="ellipse">
+                          <a:avLst/>
+                        </a:prstGeom>
+                        <a:solidFill>
+                          <a:srgbClr val="F0AEAE"/>
+                        </a:solidFill>
+                        <a:ln>
+                          <a:solidFill>
+                            <a:srgbClr val="EE0000"/>
+                          </a:solidFill>
+                        </a:ln>
+                      </wps:spPr>
+                      <wps:style>
+                        <a:lnRef idx="2">
+                          <a:schemeClr val="accent1">
+                            <a:shade val="15000"/>
+                          </a:schemeClr>
+                        </a:lnRef>
+                        <a:fillRef idx="1">
+                          <a:schemeClr val="accent1"/>
+                        </a:fillRef>
+                        <a:effectRef idx="0">
+                          <a:schemeClr val="accent1"/>
+                        </a:effectRef>
+                        <a:fontRef idx="minor">
+                          <a:schemeClr val="lt1"/>
+                        </a:fontRef>
+                      </wps:style>
+                      <wps:txbx>
+                        <w:txbxContent>
+                          <w:p>
+                            <w:pPr>
+                              <w:jc w:val="center"/>
+                              <w:rPr>
+                                <w:b/>
+                                <w:bCs/>
+                                <w:i/>
+                                <w:iCs/>
+                                <w:color w:val="000000" w:themeColor="text1"/>
+                                <w:sz w:val="28"/>
+                                <w:szCs w:val="28"/>
+                                <w:lang w:val="es-MX"/>
+                              </w:rPr>
+                            </w:pPr>
+                            <w:r>
+                              <w:rPr>
+                                <w:b/>
+                                <w:bCs/>
+                                <w:i/>
+                                <w:iCs/>
+                                <w:color w:val="000000" w:themeColor="text1"/>
+                                <w:sz w:val="28"/>
+                                <w:szCs w:val="28"/>
+                                <w:lang w:val="es-MX"/>
+                              </w:rPr>
+                              <w:t>3</w:t>
+                            </w:r>
+                          </w:p>
+                        </w:txbxContent>
+                      </wps:txbx>
+                      <wps:bodyPr rot="0" spcFirstLastPara="0" vertOverflow="overflow" horzOverflow="overflow" vert="horz" wrap="square" lIns="91440" tIns="45720" rIns="91440" bIns="45720" numCol="1" spcCol="0" rtlCol="0" fromWordArt="0" anchor="ctr" anchorCtr="0" forceAA="0" compatLnSpc="1">
+                        <a:prstTxWarp prst="textNoShape">
+                          <a:avLst/>
+                        </a:prstTxWarp>
+                        <a:noAutofit/>
+                      </wps:bodyPr>
+                    </wps:wsp>
+                  </a:graphicData>
+                </a:graphic>
+                <wp14:sizeRelH relativeFrom="margin">
+                  <wp14:pctWidth>0</wp14:pctWidth>
+                </wp14:sizeRelH>
+                <wp14:sizeRelV relativeFrom="margin">
+                  <wp14:pctHeight>0</wp14:pctHeight>
+                </wp14:sizeRelV>
+              </wp:anchor>
+            </w:drawing>
+          </mc:Choice>
+          <mc:Fallback>
+            <w:pict>
+              <v:oval w14:anchorId="49EF491D" id="_x0000_s1028" style="position:absolute;left:0;text-align:left;margin-left:433.65pt;margin-top:215.15pt;width:37.65pt;height:33.5pt;z-index:251667456;visibility:visible;mso-wrap-style:square;mso-width-percent:0;mso-height-percent:0;mso-wrap-distance-left:9pt;mso-wrap-distance-top:0;mso-wrap-distance-right:9pt;mso-wrap-distance-bottom:0;mso-position-horizontal:absolute;mso-position-horizontal-relative:margin;mso-position-vertical:absolute;mso-position-vertical-relative:text;mso-width-percent:0;mso-height-percent:0;mso-width-relative:margin;mso-height-relative:margin;v-text-anchor:middle" o:gfxdata="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" fillcolor="#f0aeae" strokecolor="#e00" strokeweight="1pt">
+                <v:stroke joinstyle="miter"/>
+                <v:textbox>
+                  <w:txbxContent>
+                    <w:p>
+                      <w:pPr>
+                        <w:jc w:val="center"/>
+                        <w:rPr>
+                          <w:b/>
+                          <w:bCs/>
+                          <w:i/>
+                          <w:iCs/>
+                          <w:color w:val="000000" w:themeColor="text1"/>
+                          <w:sz w:val="28"/>
+                          <w:szCs w:val="28"/>
+                          <w:lang w:val="es-MX"/>
+                        </w:rPr>
+                      </w:pPr>
+                      <w:r>
+                        <w:rPr>
+                          <w:b/>
+                          <w:bCs/>
+                          <w:i/>
+                          <w:iCs/>
+                          <w:color w:val="000000" w:themeColor="text1"/>
+                          <w:sz w:val="28"/>
+                          <w:szCs w:val="28"/>
+                          <w:lang w:val="es-MX"/>
+                        </w:rPr>
+                        <w:t>3</w:t>
+                      </w:r>
+                    </w:p>
+                  </w:txbxContent>
+                </v:textbox>
+                <w10:wrap anchorx="margin"/>
+              </v:oval>
+            </w:pict>
+          </mc:Fallback>
+        </mc:AlternateContent>
+      </w:r>
+      <w:r>
+        <w:rPr>
+          <w:noProof/>
+          <w:lang w:val="es-MX"/>
+        </w:rPr>
+        <mc:AlternateContent>
+          <mc:Choice Requires="wps">
+            <w:drawing>
+              <wp:anchor distT="0" distB="0" distL="114300" distR="114300" simplePos="0" relativeHeight="251663360" behindDoc="0" locked="0" layoutInCell="1" allowOverlap="1" wp14:anchorId="6585253F" wp14:editId="5AF06126">
+                <wp:simplePos x="0" y="0"/>
+                <wp:positionH relativeFrom="margin">
+                  <wp:posOffset>5518282</wp:posOffset>
+                </wp:positionH>
+                <wp:positionV relativeFrom="paragraph">
+                  <wp:posOffset>6007403</wp:posOffset>
+                </wp:positionV>
+                <wp:extent cx="478406" cy="425302"/>
+                <wp:effectExtent l="0" t="0" r="17145" b="13335"/>
+                <wp:wrapNone/>
+                <wp:docPr id="1162706860" name="Elipse 7"/>
+                <wp:cNvGraphicFramePr/>
+                <a:graphic xmlns:a="http://schemas.openxmlformats.org/drawingml/2006/main">
+                  <a:graphicData uri="http://schemas.microsoft.com/office/word/2010/wordprocessingShape">
+                    <wps:wsp>
+                      <wps:cNvSpPr/>
+                      <wps:spPr>
+                        <a:xfrm>
+                          <a:off x="0" y="0"/>
+                          <a:ext cx="478406" cy="425302"/>
+                        </a:xfrm>
+                        <a:prstGeom prst="ellipse">
+                          <a:avLst/>
+                        </a:prstGeom>
+                        <a:solidFill>
+                          <a:srgbClr val="F0AEAE"/>
+                        </a:solidFill>
+                        <a:ln>
+                          <a:solidFill>
+                            <a:srgbClr val="EE0000"/>
+                          </a:solidFill>
+                        </a:ln>
+                      </wps:spPr>
+                      <wps:style>
+                        <a:lnRef idx="2">
+                          <a:schemeClr val="accent1">
+                            <a:shade val="15000"/>
+                          </a:schemeClr>
+                        </a:lnRef>
+                        <a:fillRef idx="1">
+                          <a:schemeClr val="accent1"/>
+                        </a:fillRef>
+                        <a:effectRef idx="0">
+                          <a:schemeClr val="accent1"/>
+                        </a:effectRef>
+                        <a:fontRef idx="minor">
+                          <a:schemeClr val="lt1"/>
+                        </a:fontRef>
+                      </wps:style>
+                      <wps:txbx>
+                        <w:txbxContent>
+                          <w:p>
+                            <w:pPr>
+                              <w:jc w:val="center"/>
+                              <w:rPr>
+                                <w:b/>
+                                <w:bCs/>
+                                <w:i/>
+                                <w:iCs/>
+                                <w:color w:val="000000" w:themeColor="text1"/>
+                                <w:sz w:val="28"/>
+                                <w:szCs w:val="28"/>
+                                <w:lang w:val="es-MX"/>
+                              </w:rPr>
+                            </w:pPr>
+                            <w:r>
+                              <w:rPr>
+                                <w:b/>
+                                <w:bCs/>
+                                <w:i/>
+                                <w:iCs/>
+                                <w:color w:val="000000" w:themeColor="text1"/>
+                                <w:sz w:val="28"/>
+                                <w:szCs w:val="28"/>
+                                <w:lang w:val="es-MX"/>
+                              </w:rPr>
+                              <w:t>2</w:t>
+                            </w:r>
+                          </w:p>
+                        </w:txbxContent>
+                      </wps:txbx>
+                      <wps:bodyPr rot="0" spcFirstLastPara="0" vertOverflow="overflow" horzOverflow="overflow" vert="horz" wrap="square" lIns="91440" tIns="45720" rIns="91440" bIns="45720" numCol="1" spcCol="0" rtlCol="0" fromWordArt="0" anchor="ctr" anchorCtr="0" forceAA="0" compatLnSpc="1">
+                        <a:prstTxWarp prst="textNoShape">
+                          <a:avLst/>
+                        </a:prstTxWarp>
+                        <a:noAutofit/>
+                      </wps:bodyPr>
+                    </wps:wsp>
+                  </a:graphicData>
+                </a:graphic>
+                <wp14:sizeRelH relativeFrom="margin">
+                  <wp14:pctWidth>0</wp14:pctWidth>
+                </wp14:sizeRelH>
+                <wp14:sizeRelV relativeFrom="margin">
+                  <wp14:pctHeight>0</wp14:pctHeight>
+                </wp14:sizeRelV>
+              </wp:anchor>
+            </w:drawing>
+          </mc:Choice>
+          <mc:Fallback>
+            <w:pict>
+              <v:oval w14:anchorId="6585253F" id="_x0000_s1029" style="position:absolute;left:0;text-align:left;margin-left:434.5pt;margin-top:473pt;width:37.65pt;height:33.5pt;z-index:251663360;visibility:visible;mso-wrap-style:square;mso-width-percent:0;mso-height-percent:0;mso-wrap-distance-left:9pt;mso-wrap-distance-top:0;mso-wrap-distance-right:9pt;mso-wrap-distance-bottom:0;mso-position-horizontal:absolute;mso-position-horizontal-relative:margin;mso-position-vertical:absolute;mso-position-vertical-relative:text;mso-width-percent:0;mso-height-percent:0;mso-width-relative:margin;mso-height-relative:margin;v-text-anchor:middle" o:gfxdata="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" fillcolor="#f0aeae" strokecolor="#e00" strokeweight="1pt">
+                <v:stroke joinstyle="miter"/>
+                <v:textbox>
+                  <w:txbxContent>
+                    <w:p>
+                      <w:pPr>
+                        <w:jc w:val="center"/>
+                        <w:rPr>
+                          <w:b/>
+                          <w:bCs/>
+                          <w:i/>
+                          <w:iCs/>
+                          <w:color w:val="000000" w:themeColor="text1"/>
+                          <w:sz w:val="28"/>
+                          <w:szCs w:val="28"/>
+                          <w:lang w:val="es-MX"/>
+                        </w:rPr>
+                      </w:pPr>
+                      <w:r>
+                        <w:rPr>
+                          <w:b/>
+                          <w:bCs/>
+                          <w:i/>
+                          <w:iCs/>
+                          <w:color w:val="000000" w:themeColor="text1"/>
+                          <w:sz w:val="28"/>
+                          <w:szCs w:val="28"/>
+                          <w:lang w:val="es-MX"/>
+                        </w:rPr>
+                        <w:t>2</w:t>
+                      </w:r>
+                    </w:p>
+                  </w:txbxContent>
+                </v:textbox>
+                <w10:wrap anchorx="margin"/>
+              </v:oval>
+            </w:pict>
+          </mc:Fallback>
+        </mc:AlternateContent>
+      </w:r>
+      <w:r>
+        <w:rPr>
+          <w:noProof/>
+          <w:lang w:val="es-MX"/>
+        </w:rPr>
+        <mc:AlternateContent>
+          <mc:Choice Requires="wps">
+            <w:drawing>
+              <wp:anchor distT="0" distB="0" distL="114300" distR="114300" simplePos="0" relativeHeight="251661312" behindDoc="0" locked="0" layoutInCell="1" allowOverlap="1" wp14:anchorId="2A254000" wp14:editId="6E01FE35">
+                <wp:simplePos x="0" y="0"/>
+                <wp:positionH relativeFrom="column">
+                  <wp:posOffset>-276225</wp:posOffset>
+                </wp:positionH>
+                <wp:positionV relativeFrom="paragraph">
+                  <wp:posOffset>5879775</wp:posOffset>
+                </wp:positionV>
+                <wp:extent cx="744279" cy="669851"/>
+                <wp:effectExtent l="0" t="0" r="17780" b="16510"/>
+                <wp:wrapNone/>
+                <wp:docPr id="299766951" name="Elipse 7"/>
+                <wp:cNvGraphicFramePr/>
+                <a:graphic xmlns:a="http://schemas.openxmlformats.org/drawingml/2006/main">
+                  <a:graphicData uri="http://schemas.microsoft.com/office/word/2010/wordprocessingShape">
+                    <wps:wsp>
+                      <wps:cNvSpPr/>
+                      <wps:spPr>
+                        <a:xfrm>
+                          <a:off x="0" y="0"/>
+                          <a:ext cx="744279" cy="669851"/>
+                        </a:xfrm>
+                        <a:prstGeom prst="ellipse">
+                          <a:avLst/>
+                        </a:prstGeom>
+                        <a:solidFill>
+                          <a:srgbClr val="F0AEAE"/>
+                        </a:solidFill>
+                        <a:ln>
+                          <a:solidFill>
+                            <a:srgbClr val="EE0000"/>
+                          </a:solidFill>
+                        </a:ln>
+                      </wps:spPr>
+                      <wps:style>
+                        <a:lnRef idx="2">
+                          <a:schemeClr val="accent1">
+                            <a:shade val="15000"/>
+                          </a:schemeClr>
+                        </a:lnRef>
+                        <a:fillRef idx="1">
+                          <a:schemeClr val="accent1"/>
+                        </a:fillRef>
+                        <a:effectRef idx="0">
+                          <a:schemeClr val="accent1"/>
+                        </a:effectRef>
+                        <a:fontRef idx="minor">
+                          <a:schemeClr val="lt1"/>
+                        </a:fontRef>
+                      </wps:style>
+                      <wps:txbx>
+                        <w:txbxContent>
+                          <w:p>
+                            <w:pPr>
+                              <w:jc w:val="center"/>
+                              <w:rPr>
+                                <w:b/>
+                                <w:bCs/>
+                                <w:i/>
+                                <w:iCs/>
+                                <w:color w:val="000000" w:themeColor="text1"/>
+                                <w:sz w:val="28"/>
+                                <w:szCs w:val="28"/>
+                                <w:lang w:val="es-MX"/>
+                              </w:rPr>
+                            </w:pPr>
+                            <w:r>
+                              <w:rPr>
+                                <w:b/>
+                                <w:bCs/>
+                                <w:i/>
+                                <w:iCs/>
+                                <w:color w:val="000000" w:themeColor="text1"/>
+                                <w:sz w:val="28"/>
+                                <w:szCs w:val="28"/>
+                                <w:lang w:val="es-MX"/>
+                              </w:rPr>
+                              <w:t>1</w:t>
+                            </w:r>
+                          </w:p>
+                        </w:txbxContent>
+                      </wps:txbx>
+                      <wps:bodyPr rot="0" spcFirstLastPara="0" vertOverflow="overflow" horzOverflow="overflow" vert="horz" wrap="square" lIns="91440" tIns="45720" rIns="91440" bIns="45720" numCol="1" spcCol="0" rtlCol="0" fromWordArt="0" anchor="ctr" anchorCtr="0" forceAA="0" compatLnSpc="1">
+                        <a:prstTxWarp prst="textNoShape">
+                          <a:avLst/>
+                        </a:prstTxWarp>
+                        <a:noAutofit/>
+                      </wps:bodyPr>
+                    </wps:wsp>
+                  </a:graphicData>
+                </a:graphic>
+              </wp:anchor>
+            </w:drawing>
+          </mc:Choice>
+          <mc:Fallback>
+            <w:pict>
+              <v:oval w14:anchorId="2A254000" id="_x0000_s1030" style="position:absolute;left:0;text-align:left;margin-left:-21.75pt;margin-top:462.95pt;width:58.6pt;height:52.75pt;z-index:251661312;visibility:visible;mso-wrap-style:square;mso-wrap-distance-left:9pt;mso-wrap-distance-top:0;mso-wrap-distance-right:9pt;mso-wrap-distance-bottom:0;mso-position-horizontal:absolute;mso-position-horizontal-relative:text;mso-position-vertical:absolute;mso-position-vertical-relative:text;v-text-anchor:middle" o:gfxdata="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" fillcolor="#f0aeae" strokecolor="#e00" strokeweight="1pt">
+                <v:stroke joinstyle="miter"/>
+                <v:textbox>
+                  <w:txbxContent>
+                    <w:p>
+                      <w:pPr>
+                        <w:jc w:val="center"/>
+                        <w:rPr>
+                          <w:b/>
+                          <w:bCs/>
+                          <w:i/>
+                          <w:iCs/>
+                          <w:color w:val="000000" w:themeColor="text1"/>
+                          <w:sz w:val="28"/>
+                          <w:szCs w:val="28"/>
+                          <w:lang w:val="es-MX"/>
+                        </w:rPr>
+                      </w:pPr>
+                      <w:r>
+                        <w:rPr>
+                          <w:b/>
+                          <w:bCs/>
+                          <w:i/>
+                          <w:iCs/>
+                          <w:color w:val="000000" w:themeColor="text1"/>
+                          <w:sz w:val="28"/>
+                          <w:szCs w:val="28"/>
+                          <w:lang w:val="es-MX"/>
+                        </w:rPr>
+                        <w:t>1</w:t>
+                      </w:r>
+                    </w:p>
+                  </w:txbxContent>
+                </v:textbox>
+              </v:oval>
+            </w:pict>
+          </mc:Fallback>
+        </mc:AlternateContent>
+      </w:r>
+      <w:r>
+        <w:rPr>
+          <w:noProof/>
+          <w:lang w:val="es-MX"/>
+        </w:rPr>
+        <w:drawing>
+          <wp:inline distT="0" distB="0" distL="0" distR="0" wp14:anchorId="0A321889" wp14:editId="3130CD1E">
+            <wp:extent cx="7857038" cy="5006812"/>
+            <wp:effectExtent l="0" t="3492" r="7302" b="7303"/>
+            <wp:docPr id="710588481" name="Imagen 6"/>
+            <wp:cNvGraphicFramePr>
+              <a:graphicFrameLocks xmlns:a="http://schemas.openxmlformats.org/drawingml/2006/main" noChangeAspect="1"/>
+            </wp:cNvGraphicFramePr>
+            <a:graphic xmlns:a="http://schemas.openxmlformats.org/drawingml/2006/main">
+              <a:graphicData uri="http://schemas.openxmlformats.org/drawingml/2006/picture">
+                <pic:pic xmlns:pic="http://schemas.openxmlformats.org/drawingml/2006/picture">
+                  <pic:nvPicPr>
+                    <pic:cNvPr id="0" name="Picture 6"/>
+                    <pic:cNvPicPr>
+                      <a:picLocks noChangeAspect="1" noChangeArrowheads="1"/>
+                    </pic:cNvPicPr>
+                  </pic:nvPicPr>
+                  <pic:blipFill>
+                    <a:blip r:embed="rId18" cstate="print">
                       <a:extLst>
                         <a:ext uri="{28A0092B-C50C-407E-A947-70E740481C1C}">
                           <a14:useLocalDpi xmlns:a14="http://schemas.microsoft.com/office/drawing/2010/main" val="0"/>
@@ -3789,7 +4884,512 @@
                   <pic:spPr bwMode="auto">
                     <a:xfrm rot="16200000">
                       <a:off x="0" y="0"/>
-                      <a:ext cx="7439783" cy="5813495"/>
+                      <a:ext cx="7869115" cy="5014508"/>
+                    </a:xfrm>
+                    <a:prstGeom prst="rect">
+                      <a:avLst/>
+                    </a:prstGeom>
+                    <a:noFill/>
+                    <a:ln>
+                      <a:noFill/>
+                    </a:ln>
+                  </pic:spPr>
+                </pic:pic>
+              </a:graphicData>
+            </a:graphic>
+          </wp:inline>
+        </w:drawing>
+      </w:r>
+      <w:r>
+        <w:rPr>
+          <w:noProof/>
+          <w:lang w:val="es-MX"/>
+        </w:rPr>
+        <w:lastRenderedPageBreak/>
+        <mc:AlternateContent>
+          <mc:Choice Requires="wps">
+            <w:drawing>
+              <wp:anchor distT="0" distB="0" distL="114300" distR="114300" simplePos="0" relativeHeight="251673600" behindDoc="0" locked="0" layoutInCell="1" allowOverlap="1" wp14:anchorId="12BEA14A" wp14:editId="1620D83F">
+                <wp:simplePos x="0" y="0"/>
+                <wp:positionH relativeFrom="margin">
+                  <wp:posOffset>736881</wp:posOffset>
+                </wp:positionH>
+                <wp:positionV relativeFrom="paragraph">
+                  <wp:posOffset>354182</wp:posOffset>
+                </wp:positionV>
+                <wp:extent cx="478406" cy="425302"/>
+                <wp:effectExtent l="0" t="0" r="17145" b="13335"/>
+                <wp:wrapNone/>
+                <wp:docPr id="1655973154" name="Elipse 7"/>
+                <wp:cNvGraphicFramePr/>
+                <a:graphic xmlns:a="http://schemas.openxmlformats.org/drawingml/2006/main">
+                  <a:graphicData uri="http://schemas.microsoft.com/office/word/2010/wordprocessingShape">
+                    <wps:wsp>
+                      <wps:cNvSpPr/>
+                      <wps:spPr>
+                        <a:xfrm>
+                          <a:off x="0" y="0"/>
+                          <a:ext cx="478406" cy="425302"/>
+                        </a:xfrm>
+                        <a:prstGeom prst="ellipse">
+                          <a:avLst/>
+                        </a:prstGeom>
+                        <a:solidFill>
+                          <a:srgbClr val="F0AEAE"/>
+                        </a:solidFill>
+                        <a:ln>
+                          <a:solidFill>
+                            <a:srgbClr val="EE0000"/>
+                          </a:solidFill>
+                        </a:ln>
+                      </wps:spPr>
+                      <wps:style>
+                        <a:lnRef idx="2">
+                          <a:schemeClr val="accent1">
+                            <a:shade val="15000"/>
+                          </a:schemeClr>
+                        </a:lnRef>
+                        <a:fillRef idx="1">
+                          <a:schemeClr val="accent1"/>
+                        </a:fillRef>
+                        <a:effectRef idx="0">
+                          <a:schemeClr val="accent1"/>
+                        </a:effectRef>
+                        <a:fontRef idx="minor">
+                          <a:schemeClr val="lt1"/>
+                        </a:fontRef>
+                      </wps:style>
+                      <wps:txbx>
+                        <w:txbxContent>
+                          <w:p>
+                            <w:pPr>
+                              <w:jc w:val="center"/>
+                              <w:rPr>
+                                <w:b/>
+                                <w:bCs/>
+                                <w:i/>
+                                <w:iCs/>
+                                <w:color w:val="000000" w:themeColor="text1"/>
+                                <w:sz w:val="28"/>
+                                <w:szCs w:val="28"/>
+                                <w:lang w:val="es-MX"/>
+                              </w:rPr>
+                            </w:pPr>
+                            <w:r>
+                              <w:rPr>
+                                <w:b/>
+                                <w:bCs/>
+                                <w:i/>
+                                <w:iCs/>
+                                <w:color w:val="000000" w:themeColor="text1"/>
+                                <w:sz w:val="28"/>
+                                <w:szCs w:val="28"/>
+                                <w:lang w:val="es-MX"/>
+                              </w:rPr>
+                              <w:t>4</w:t>
+                            </w:r>
+                          </w:p>
+                        </w:txbxContent>
+                      </wps:txbx>
+                      <wps:bodyPr rot="0" spcFirstLastPara="0" vertOverflow="overflow" horzOverflow="overflow" vert="horz" wrap="square" lIns="91440" tIns="45720" rIns="91440" bIns="45720" numCol="1" spcCol="0" rtlCol="0" fromWordArt="0" anchor="ctr" anchorCtr="0" forceAA="0" compatLnSpc="1">
+                        <a:prstTxWarp prst="textNoShape">
+                          <a:avLst/>
+                        </a:prstTxWarp>
+                        <a:noAutofit/>
+                      </wps:bodyPr>
+                    </wps:wsp>
+                  </a:graphicData>
+                </a:graphic>
+                <wp14:sizeRelH relativeFrom="margin">
+                  <wp14:pctWidth>0</wp14:pctWidth>
+                </wp14:sizeRelH>
+                <wp14:sizeRelV relativeFrom="margin">
+                  <wp14:pctHeight>0</wp14:pctHeight>
+                </wp14:sizeRelV>
+              </wp:anchor>
+            </w:drawing>
+          </mc:Choice>
+          <mc:Fallback>
+            <w:pict>
+              <v:oval w14:anchorId="12BEA14A" id="_x0000_s1031" style="position:absolute;left:0;text-align:left;margin-left:58pt;margin-top:27.9pt;width:37.65pt;height:33.5pt;z-index:251673600;visibility:visible;mso-wrap-style:square;mso-width-percent:0;mso-height-percent:0;mso-wrap-distance-left:9pt;mso-wrap-distance-top:0;mso-wrap-distance-right:9pt;mso-wrap-distance-bottom:0;mso-position-horizontal:absolute;mso-position-horizontal-relative:margin;mso-position-vertical:absolute;mso-position-vertical-relative:text;mso-width-percent:0;mso-height-percent:0;mso-width-relative:margin;mso-height-relative:margin;v-text-anchor:middle" o:gfxdata="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" fillcolor="#f0aeae" strokecolor="#e00" strokeweight="1pt">
+                <v:stroke joinstyle="miter"/>
+                <v:textbox>
+                  <w:txbxContent>
+                    <w:p>
+                      <w:pPr>
+                        <w:jc w:val="center"/>
+                        <w:rPr>
+                          <w:b/>
+                          <w:bCs/>
+                          <w:i/>
+                          <w:iCs/>
+                          <w:color w:val="000000" w:themeColor="text1"/>
+                          <w:sz w:val="28"/>
+                          <w:szCs w:val="28"/>
+                          <w:lang w:val="es-MX"/>
+                        </w:rPr>
+                      </w:pPr>
+                      <w:r>
+                        <w:rPr>
+                          <w:b/>
+                          <w:bCs/>
+                          <w:i/>
+                          <w:iCs/>
+                          <w:color w:val="000000" w:themeColor="text1"/>
+                          <w:sz w:val="28"/>
+                          <w:szCs w:val="28"/>
+                          <w:lang w:val="es-MX"/>
+                        </w:rPr>
+                        <w:t>4</w:t>
+                      </w:r>
+                    </w:p>
+                  </w:txbxContent>
+                </v:textbox>
+                <w10:wrap anchorx="margin"/>
+              </v:oval>
+            </w:pict>
+          </mc:Fallback>
+        </mc:AlternateContent>
+      </w:r>
+      <w:r>
+        <w:rPr>
+          <w:noProof/>
+          <w:lang w:val="es-MX"/>
+        </w:rPr>
+        <mc:AlternateContent>
+          <mc:Choice Requires="wps">
+            <w:drawing>
+              <wp:anchor distT="0" distB="0" distL="114300" distR="114300" simplePos="0" relativeHeight="251669504" behindDoc="0" locked="0" layoutInCell="1" allowOverlap="1" wp14:anchorId="2D246190" wp14:editId="1AA972F0">
+                <wp:simplePos x="0" y="0"/>
+                <wp:positionH relativeFrom="margin">
+                  <wp:posOffset>701749</wp:posOffset>
+                </wp:positionH>
+                <wp:positionV relativeFrom="paragraph">
+                  <wp:posOffset>2775098</wp:posOffset>
+                </wp:positionV>
+                <wp:extent cx="478406" cy="425302"/>
+                <wp:effectExtent l="0" t="0" r="17145" b="13335"/>
+                <wp:wrapNone/>
+                <wp:docPr id="1023924286" name="Elipse 7"/>
+                <wp:cNvGraphicFramePr/>
+                <a:graphic xmlns:a="http://schemas.openxmlformats.org/drawingml/2006/main">
+                  <a:graphicData uri="http://schemas.microsoft.com/office/word/2010/wordprocessingShape">
+                    <wps:wsp>
+                      <wps:cNvSpPr/>
+                      <wps:spPr>
+                        <a:xfrm>
+                          <a:off x="0" y="0"/>
+                          <a:ext cx="478406" cy="425302"/>
+                        </a:xfrm>
+                        <a:prstGeom prst="ellipse">
+                          <a:avLst/>
+                        </a:prstGeom>
+                        <a:solidFill>
+                          <a:srgbClr val="F0AEAE"/>
+                        </a:solidFill>
+                        <a:ln>
+                          <a:solidFill>
+                            <a:srgbClr val="EE0000"/>
+                          </a:solidFill>
+                        </a:ln>
+                      </wps:spPr>
+                      <wps:style>
+                        <a:lnRef idx="2">
+                          <a:schemeClr val="accent1">
+                            <a:shade val="15000"/>
+                          </a:schemeClr>
+                        </a:lnRef>
+                        <a:fillRef idx="1">
+                          <a:schemeClr val="accent1"/>
+                        </a:fillRef>
+                        <a:effectRef idx="0">
+                          <a:schemeClr val="accent1"/>
+                        </a:effectRef>
+                        <a:fontRef idx="minor">
+                          <a:schemeClr val="lt1"/>
+                        </a:fontRef>
+                      </wps:style>
+                      <wps:txbx>
+                        <w:txbxContent>
+                          <w:p>
+                            <w:pPr>
+                              <w:jc w:val="center"/>
+                              <w:rPr>
+                                <w:b/>
+                                <w:bCs/>
+                                <w:i/>
+                                <w:iCs/>
+                                <w:color w:val="000000" w:themeColor="text1"/>
+                                <w:sz w:val="28"/>
+                                <w:szCs w:val="28"/>
+                                <w:lang w:val="es-MX"/>
+                              </w:rPr>
+                            </w:pPr>
+                            <w:r>
+                              <w:rPr>
+                                <w:b/>
+                                <w:bCs/>
+                                <w:i/>
+                                <w:iCs/>
+                                <w:color w:val="000000" w:themeColor="text1"/>
+                                <w:sz w:val="28"/>
+                                <w:szCs w:val="28"/>
+                                <w:lang w:val="es-MX"/>
+                              </w:rPr>
+                              <w:t>3</w:t>
+                            </w:r>
+                          </w:p>
+                        </w:txbxContent>
+                      </wps:txbx>
+                      <wps:bodyPr rot="0" spcFirstLastPara="0" vertOverflow="overflow" horzOverflow="overflow" vert="horz" wrap="square" lIns="91440" tIns="45720" rIns="91440" bIns="45720" numCol="1" spcCol="0" rtlCol="0" fromWordArt="0" anchor="ctr" anchorCtr="0" forceAA="0" compatLnSpc="1">
+                        <a:prstTxWarp prst="textNoShape">
+                          <a:avLst/>
+                        </a:prstTxWarp>
+                        <a:noAutofit/>
+                      </wps:bodyPr>
+                    </wps:wsp>
+                  </a:graphicData>
+                </a:graphic>
+                <wp14:sizeRelH relativeFrom="margin">
+                  <wp14:pctWidth>0</wp14:pctWidth>
+                </wp14:sizeRelH>
+                <wp14:sizeRelV relativeFrom="margin">
+                  <wp14:pctHeight>0</wp14:pctHeight>
+                </wp14:sizeRelV>
+              </wp:anchor>
+            </w:drawing>
+          </mc:Choice>
+          <mc:Fallback>
+            <w:pict>
+              <v:oval w14:anchorId="2D246190" id="_x0000_s1032" style="position:absolute;left:0;text-align:left;margin-left:55.25pt;margin-top:218.5pt;width:37.65pt;height:33.5pt;z-index:251669504;visibility:visible;mso-wrap-style:square;mso-width-percent:0;mso-height-percent:0;mso-wrap-distance-left:9pt;mso-wrap-distance-top:0;mso-wrap-distance-right:9pt;mso-wrap-distance-bottom:0;mso-position-horizontal:absolute;mso-position-horizontal-relative:margin;mso-position-vertical:absolute;mso-position-vertical-relative:text;mso-width-percent:0;mso-height-percent:0;mso-width-relative:margin;mso-height-relative:margin;v-text-anchor:middle" o:gfxdata="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" fillcolor="#f0aeae" strokecolor="#e00" strokeweight="1pt">
+                <v:stroke joinstyle="miter"/>
+                <v:textbox>
+                  <w:txbxContent>
+                    <w:p>
+                      <w:pPr>
+                        <w:jc w:val="center"/>
+                        <w:rPr>
+                          <w:b/>
+                          <w:bCs/>
+                          <w:i/>
+                          <w:iCs/>
+                          <w:color w:val="000000" w:themeColor="text1"/>
+                          <w:sz w:val="28"/>
+                          <w:szCs w:val="28"/>
+                          <w:lang w:val="es-MX"/>
+                        </w:rPr>
+                      </w:pPr>
+                      <w:r>
+                        <w:rPr>
+                          <w:b/>
+                          <w:bCs/>
+                          <w:i/>
+                          <w:iCs/>
+                          <w:color w:val="000000" w:themeColor="text1"/>
+                          <w:sz w:val="28"/>
+                          <w:szCs w:val="28"/>
+                          <w:lang w:val="es-MX"/>
+                        </w:rPr>
+                        <w:t>3</w:t>
+                      </w:r>
+                    </w:p>
+                  </w:txbxContent>
+                </v:textbox>
+                <w10:wrap anchorx="margin"/>
+              </v:oval>
+            </w:pict>
+          </mc:Fallback>
+        </mc:AlternateContent>
+      </w:r>
+      <w:r>
+        <w:rPr>
+          <w:noProof/>
+          <w:lang w:val="es-MX"/>
+        </w:rPr>
+        <mc:AlternateContent>
+          <mc:Choice Requires="wps">
+            <w:drawing>
+              <wp:anchor distT="0" distB="0" distL="114300" distR="114300" simplePos="0" relativeHeight="251665408" behindDoc="0" locked="0" layoutInCell="1" allowOverlap="1" wp14:anchorId="5368E799" wp14:editId="7D0979C1">
+                <wp:simplePos x="0" y="0"/>
+                <wp:positionH relativeFrom="margin">
+                  <wp:posOffset>673248</wp:posOffset>
+                </wp:positionH>
+                <wp:positionV relativeFrom="paragraph">
+                  <wp:posOffset>5925583</wp:posOffset>
+                </wp:positionV>
+                <wp:extent cx="478406" cy="425302"/>
+                <wp:effectExtent l="0" t="0" r="17145" b="13335"/>
+                <wp:wrapNone/>
+                <wp:docPr id="557221209" name="Elipse 7"/>
+                <wp:cNvGraphicFramePr/>
+                <a:graphic xmlns:a="http://schemas.openxmlformats.org/drawingml/2006/main">
+                  <a:graphicData uri="http://schemas.microsoft.com/office/word/2010/wordprocessingShape">
+                    <wps:wsp>
+                      <wps:cNvSpPr/>
+                      <wps:spPr>
+                        <a:xfrm>
+                          <a:off x="0" y="0"/>
+                          <a:ext cx="478406" cy="425302"/>
+                        </a:xfrm>
+                        <a:prstGeom prst="ellipse">
+                          <a:avLst/>
+                        </a:prstGeom>
+                        <a:solidFill>
+                          <a:srgbClr val="F0AEAE"/>
+                        </a:solidFill>
+                        <a:ln>
+                          <a:solidFill>
+                            <a:srgbClr val="EE0000"/>
+                          </a:solidFill>
+                        </a:ln>
+                      </wps:spPr>
+                      <wps:style>
+                        <a:lnRef idx="2">
+                          <a:schemeClr val="accent1">
+                            <a:shade val="15000"/>
+                          </a:schemeClr>
+                        </a:lnRef>
+                        <a:fillRef idx="1">
+                          <a:schemeClr val="accent1"/>
+                        </a:fillRef>
+                        <a:effectRef idx="0">
+                          <a:schemeClr val="accent1"/>
+                        </a:effectRef>
+                        <a:fontRef idx="minor">
+                          <a:schemeClr val="lt1"/>
+                        </a:fontRef>
+                      </wps:style>
+                      <wps:txbx>
+                        <w:txbxContent>
+                          <w:p>
+                            <w:pPr>
+                              <w:jc w:val="center"/>
+                              <w:rPr>
+                                <w:b/>
+                                <w:bCs/>
+                                <w:i/>
+                                <w:iCs/>
+                                <w:color w:val="000000" w:themeColor="text1"/>
+                                <w:sz w:val="28"/>
+                                <w:szCs w:val="28"/>
+                                <w:lang w:val="es-MX"/>
+                              </w:rPr>
+                            </w:pPr>
+                            <w:r>
+                              <w:rPr>
+                                <w:b/>
+                                <w:bCs/>
+                                <w:i/>
+                                <w:iCs/>
+                                <w:color w:val="000000" w:themeColor="text1"/>
+                                <w:sz w:val="28"/>
+                                <w:szCs w:val="28"/>
+                                <w:lang w:val="es-MX"/>
+                              </w:rPr>
+                              <w:t>2</w:t>
+                            </w:r>
+                          </w:p>
+                        </w:txbxContent>
+                      </wps:txbx>
+                      <wps:bodyPr rot="0" spcFirstLastPara="0" vertOverflow="overflow" horzOverflow="overflow" vert="horz" wrap="square" lIns="91440" tIns="45720" rIns="91440" bIns="45720" numCol="1" spcCol="0" rtlCol="0" fromWordArt="0" anchor="ctr" anchorCtr="0" forceAA="0" compatLnSpc="1">
+                        <a:prstTxWarp prst="textNoShape">
+                          <a:avLst/>
+                        </a:prstTxWarp>
+                        <a:noAutofit/>
+                      </wps:bodyPr>
+                    </wps:wsp>
+                  </a:graphicData>
+                </a:graphic>
+                <wp14:sizeRelH relativeFrom="margin">
+                  <wp14:pctWidth>0</wp14:pctWidth>
+                </wp14:sizeRelH>
+                <wp14:sizeRelV relativeFrom="margin">
+                  <wp14:pctHeight>0</wp14:pctHeight>
+                </wp14:sizeRelV>
+              </wp:anchor>
+            </w:drawing>
+          </mc:Choice>
+          <mc:Fallback>
+            <w:pict>
+              <v:oval w14:anchorId="5368E799" id="_x0000_s1033" style="position:absolute;left:0;text-align:left;margin-left:53pt;margin-top:466.6pt;width:37.65pt;height:33.5pt;z-index:251665408;visibility:visible;mso-wrap-style:square;mso-width-percent:0;mso-height-percent:0;mso-wrap-distance-left:9pt;mso-wrap-distance-top:0;mso-wrap-distance-right:9pt;mso-wrap-distance-bottom:0;mso-position-horizontal:absolute;mso-position-horizontal-relative:margin;mso-position-vertical:absolute;mso-position-vertical-relative:text;mso-width-percent:0;mso-height-percent:0;mso-width-relative:margin;mso-height-relative:margin;v-text-anchor:middle" o:gfxdata="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" fillcolor="#f0aeae" strokecolor="#e00" strokeweight="1pt">
+                <v:stroke joinstyle="miter"/>
+                <v:textbox>
+                  <w:txbxContent>
+                    <w:p>
+                      <w:pPr>
+                        <w:jc w:val="center"/>
+                        <w:rPr>
+                          <w:b/>
+                          <w:bCs/>
+                          <w:i/>
+                          <w:iCs/>
+                          <w:color w:val="000000" w:themeColor="text1"/>
+                          <w:sz w:val="28"/>
+                          <w:szCs w:val="28"/>
+                          <w:lang w:val="es-MX"/>
+                        </w:rPr>
+                      </w:pPr>
+                      <w:r>
+                        <w:rPr>
+                          <w:b/>
+                          <w:bCs/>
+                          <w:i/>
+                          <w:iCs/>
+                          <w:color w:val="000000" w:themeColor="text1"/>
+                          <w:sz w:val="28"/>
+                          <w:szCs w:val="28"/>
+                          <w:lang w:val="es-MX"/>
+                        </w:rPr>
+                        <w:t>2</w:t>
+                      </w:r>
+                    </w:p>
+                  </w:txbxContent>
+                </v:textbox>
+                <w10:wrap anchorx="margin"/>
+              </v:oval>
+            </w:pict>
+          </mc:Fallback>
+        </mc:AlternateContent>
+      </w:r>
+      <w:r>
+        <w:rPr>
+          <w:noProof/>
+          <w:lang w:val="es-MX"/>
+        </w:rPr>
+        <w:drawing>
+          <wp:inline distT="0" distB="0" distL="0" distR="0" wp14:anchorId="4B5A0BF4" wp14:editId="5BAA594D">
+            <wp:extent cx="7713691" cy="3546809"/>
+            <wp:effectExtent l="6985" t="0" r="8890" b="8890"/>
+            <wp:docPr id="1868790270" name="Imagen 5"/>
+            <wp:cNvGraphicFramePr>
+              <a:graphicFrameLocks xmlns:a="http://schemas.openxmlformats.org/drawingml/2006/main" noChangeAspect="1"/>
+            </wp:cNvGraphicFramePr>
+            <a:graphic xmlns:a="http://schemas.openxmlformats.org/drawingml/2006/main">
+              <a:graphicData uri="http://schemas.openxmlformats.org/drawingml/2006/picture">
+                <pic:pic xmlns:pic="http://schemas.openxmlformats.org/drawingml/2006/picture">
+                  <pic:nvPicPr>
+                    <pic:cNvPr id="0" name="Picture 5"/>
+                    <pic:cNvPicPr>
+                      <a:picLocks noChangeAspect="1" noChangeArrowheads="1"/>
+                    </pic:cNvPicPr>
+                  </pic:nvPicPr>
+                  <pic:blipFill>
+                    <a:blip r:embed="rId19" cstate="print">
+                      <a:extLst>
+                        <a:ext uri="{28A0092B-C50C-407E-A947-70E740481C1C}">
+                          <a14:useLocalDpi xmlns:a14="http://schemas.microsoft.com/office/drawing/2010/main" val="0"/>
+                        </a:ext>
+                      </a:extLst>
+                    </a:blip>
+                    <a:srcRect/>
+                    <a:stretch>
+                      <a:fillRect/>
+                    </a:stretch>
+                  </pic:blipFill>
+                  <pic:spPr bwMode="auto">
+                    <a:xfrm rot="16200000">
+                      <a:off x="0" y="0"/>
+                      <a:ext cx="7747685" cy="3562439"/>
                     </a:xfrm>
                     <a:prstGeom prst="rect">
                       <a:avLst/>
@@ -3851,7 +5451,7 @@
                     </pic:cNvPicPr>
                   </pic:nvPicPr>
                   <pic:blipFill>
-                    <a:blip r:embed="rId18" cstate="print">
+                    <a:blip r:embed="rId20" cstate="print">
                       <a:extLst>
                         <a:ext uri="{28A0092B-C50C-407E-A947-70E740481C1C}">
                           <a14:useLocalDpi xmlns:a14="http://schemas.microsoft.com/office/drawing/2010/main" val="0"/>
@@ -4000,68 +5600,58 @@
     </w:p>
     <w:p>
       <w:pPr>
-        <w:rPr>
-          <w:lang w:val="es-MX"/>
-        </w:rPr>
-      </w:pPr>
-      <w:r>
-        <w:rPr>
-          <w:b/>
-          <w:bCs/>
-          <w:sz w:val="32"/>
-          <w:szCs w:val="32"/>
-          <w:lang w:val="es-MX"/>
-        </w:rPr>
-        <w:t>-</w:t>
-      </w:r>
-    </w:p>
-    <w:p>
-      <w:pPr>
-        <w:rPr>
-          <w:b/>
-          <w:bCs/>
-          <w:sz w:val="32"/>
-          <w:szCs w:val="32"/>
-          <w:lang w:val="es-MX"/>
-        </w:rPr>
-      </w:pPr>
-      <w:r>
-        <w:rPr>
-          <w:b/>
-          <w:bCs/>
-          <w:sz w:val="32"/>
-          <w:szCs w:val="32"/>
-          <w:lang w:val="es-MX"/>
-        </w:rPr>
-        <w:t>Bibliografí</w:t>
-      </w:r>
-      <w:r>
-        <w:rPr>
-          <w:b/>
-          <w:bCs/>
-          <w:sz w:val="32"/>
-          <w:szCs w:val="32"/>
-          <w:lang w:val="es-MX"/>
-        </w:rPr>
-        <w:t>a</w:t>
-      </w:r>
-    </w:p>
-    <w:p>
-      <w:pPr>
-        <w:rPr>
-          <w:lang w:val="es-MX"/>
-        </w:rPr>
-      </w:pPr>
-      <w:r>
-        <w:rPr>
-          <w:b/>
-          <w:bCs/>
-          <w:sz w:val="32"/>
-          <w:szCs w:val="32"/>
-          <w:lang w:val="es-MX"/>
-        </w:rPr>
-        <w:t>-</w:t>
-      </w:r>
+        <w:jc w:val="center"/>
+        <w:rPr>
+          <w:lang w:val="es-MX"/>
+        </w:rPr>
+      </w:pPr>
+      <w:r>
+        <w:rPr>
+          <w:lang w:val="es-MX"/>
+        </w:rPr>
+        <w:drawing>
+          <wp:inline distT="0" distB="0" distL="0" distR="0" wp14:anchorId="78EFF8AB" wp14:editId="29239E7A">
+            <wp:extent cx="4944165" cy="4429743"/>
+            <wp:effectExtent l="0" t="0" r="8890" b="9525"/>
+            <wp:docPr id="93558140" name="Imagen 1"/>
+            <wp:cNvGraphicFramePr>
+              <a:graphicFrameLocks xmlns:a="http://schemas.openxmlformats.org/drawingml/2006/main" noChangeAspect="1"/>
+            </wp:cNvGraphicFramePr>
+            <a:graphic xmlns:a="http://schemas.openxmlformats.org/drawingml/2006/main">
+              <a:graphicData uri="http://schemas.openxmlformats.org/drawingml/2006/picture">
+                <pic:pic xmlns:pic="http://schemas.openxmlformats.org/drawingml/2006/picture">
+                  <pic:nvPicPr>
+                    <pic:cNvPr id="93558140" name=""/>
+                    <pic:cNvPicPr/>
+                  </pic:nvPicPr>
+                  <pic:blipFill>
+                    <a:blip r:embed="rId21"/>
+                    <a:stretch>
+                      <a:fillRect/>
+                    </a:stretch>
+                  </pic:blipFill>
+                  <pic:spPr>
+                    <a:xfrm>
+                      <a:off x="0" y="0"/>
+                      <a:ext cx="4944165" cy="4429743"/>
+                    </a:xfrm>
+                    <a:prstGeom prst="rect">
+                      <a:avLst/>
+                    </a:prstGeom>
+                  </pic:spPr>
+                </pic:pic>
+              </a:graphicData>
+            </a:graphic>
+          </wp:inline>
+        </w:drawing>
+      </w:r>
+    </w:p>
+    <w:p>
+      <w:pPr>
+        <w:rPr>
+          <w:lang w:val="es-MX"/>
+        </w:rPr>
+      </w:pPr>
     </w:p>
     <w:sectPr>
       <w:pgSz w:w="12240" w:h="15840"/>
@@ -5132,6 +6722,7 @@
   <w:style w:type="character" w:default="1" w:styleId="Fuentedeprrafopredeter">
     <w:name w:val="Default Paragraph Font"/>
     <w:uiPriority w:val="1"/>
+    <w:semiHidden/>
     <w:unhideWhenUsed/>
   </w:style>
   <w:style w:type="table" w:default="1" w:styleId="Tablanormal">

</xml_diff>